<commit_message>
Complete Week 2 EDA & Visualization
</commit_message>
<xml_diff>
--- a/reports/Week_1.docx
+++ b/reports/Week_1.docx
@@ -211,29 +211,51 @@
         </w:rPr>
         <w:t xml:space="preserve"> </w:t>
       </w:r>
-      <w:hyperlink r:id="rId5" w:history="1">
-        <w:r>
-          <w:rPr>
-            <w:rStyle w:val="Hyperlink"/>
-            <w:rFonts w:ascii="Aptos" w:eastAsiaTheme="majorEastAsia" w:hAnsi="Aptos"/>
-          </w:rPr>
-          <w:t>https://www.kaggle.com/datasets/mansiagga</w:t>
-        </w:r>
-        <w:r>
-          <w:rPr>
-            <w:rStyle w:val="Hyperlink"/>
-            <w:rFonts w:ascii="Aptos" w:eastAsiaTheme="majorEastAsia" w:hAnsi="Aptos"/>
-          </w:rPr>
-          <w:t>r</w:t>
-        </w:r>
-        <w:r>
-          <w:rPr>
-            <w:rStyle w:val="Hyperlink"/>
-            <w:rFonts w:ascii="Aptos" w:eastAsiaTheme="majorEastAsia" w:hAnsi="Aptos"/>
-          </w:rPr>
-          <w:t>wal88/diabetes-risk-prediction</w:t>
-        </w:r>
-      </w:hyperlink>
+      <w:bookmarkStart w:id="0" w:name="_Hlk243123875"/>
+      <w:r>
+        <w:rPr>
+          <w:rFonts w:ascii="Aptos" w:eastAsiaTheme="majorEastAsia" w:hAnsi="Aptos"/>
+        </w:rPr>
+        <w:fldChar w:fldCharType="begin"/>
+      </w:r>
+      <w:r>
+        <w:rPr>
+          <w:rFonts w:ascii="Aptos" w:eastAsiaTheme="majorEastAsia" w:hAnsi="Aptos"/>
+        </w:rPr>
+        <w:instrText>HYPERLINK "</w:instrText>
+      </w:r>
+      <w:r>
+        <w:rPr>
+          <w:rFonts w:ascii="Aptos" w:eastAsiaTheme="majorEastAsia" w:hAnsi="Aptos"/>
+        </w:rPr>
+        <w:instrText>https://www.kaggle.com/datasets/mansiaggarwal88/diabetes-risk-prediction</w:instrText>
+      </w:r>
+      <w:r>
+        <w:rPr>
+          <w:rFonts w:ascii="Aptos" w:eastAsiaTheme="majorEastAsia" w:hAnsi="Aptos"/>
+        </w:rPr>
+        <w:instrText>"</w:instrText>
+      </w:r>
+      <w:r>
+        <w:rPr>
+          <w:rFonts w:ascii="Aptos" w:eastAsiaTheme="majorEastAsia" w:hAnsi="Aptos"/>
+        </w:rPr>
+        <w:fldChar w:fldCharType="separate"/>
+      </w:r>
+      <w:r>
+        <w:rPr>
+          <w:rStyle w:val="Hyperlink"/>
+          <w:rFonts w:ascii="Aptos" w:eastAsiaTheme="majorEastAsia" w:hAnsi="Aptos"/>
+        </w:rPr>
+        <w:t>https://www.kaggle.com/datasets/mansiaggarwal88/diabetes-risk-prediction</w:t>
+      </w:r>
+      <w:r>
+        <w:rPr>
+          <w:rFonts w:ascii="Aptos" w:eastAsiaTheme="majorEastAsia" w:hAnsi="Aptos"/>
+        </w:rPr>
+        <w:fldChar w:fldCharType="end"/>
+      </w:r>
+      <w:bookmarkEnd w:id="0"/>
     </w:p>
     <w:p>
       <w:pPr>
@@ -688,7 +710,9 @@
           <w:szCs w:val="24"/>
         </w:rPr>
         <w:tab/>
-      </w:r>
+        <w:t xml:space="preserve">import </w:t>
+      </w:r>
+      <w:proofErr w:type="spellStart"/>
       <w:r>
         <w:rPr>
           <w:rStyle w:val="HTMLCode"/>
@@ -698,9 +722,9 @@
           <w:sz w:val="24"/>
           <w:szCs w:val="24"/>
         </w:rPr>
-        <w:t xml:space="preserve">import </w:t>
-      </w:r>
-      <w:proofErr w:type="spellStart"/>
+        <w:t>numpy</w:t>
+      </w:r>
+      <w:proofErr w:type="spellEnd"/>
       <w:r>
         <w:rPr>
           <w:rStyle w:val="HTMLCode"/>
@@ -710,10 +734,12 @@
           <w:sz w:val="24"/>
           <w:szCs w:val="24"/>
         </w:rPr>
-        <w:t>numpy</w:t>
-      </w:r>
-      <w:proofErr w:type="spellEnd"/>
-      <w:r>
+        <w:t xml:space="preserve"> as np</w:t>
+      </w:r>
+    </w:p>
+    <w:p>
+      <w:pPr>
+        <w:pStyle w:val="HTMLPreformatted"/>
         <w:rPr>
           <w:rStyle w:val="HTMLCode"/>
           <w:rFonts w:ascii="Aptos" w:eastAsiaTheme="majorEastAsia" w:hAnsi="Aptos"/>
@@ -722,12 +748,8 @@
           <w:sz w:val="24"/>
           <w:szCs w:val="24"/>
         </w:rPr>
-        <w:t xml:space="preserve"> as np</w:t>
-      </w:r>
-    </w:p>
-    <w:p>
-      <w:pPr>
-        <w:pStyle w:val="HTMLPreformatted"/>
+      </w:pPr>
+      <w:r>
         <w:rPr>
           <w:rStyle w:val="HTMLCode"/>
           <w:rFonts w:ascii="Aptos" w:eastAsiaTheme="majorEastAsia" w:hAnsi="Aptos"/>
@@ -736,7 +758,11 @@
           <w:sz w:val="24"/>
           <w:szCs w:val="24"/>
         </w:rPr>
-      </w:pPr>
+        <w:tab/>
+        <w:t xml:space="preserve">import </w:t>
+      </w:r>
+      <w:proofErr w:type="spellStart"/>
+      <w:proofErr w:type="gramStart"/>
       <w:r>
         <w:rPr>
           <w:rStyle w:val="HTMLCode"/>
@@ -746,8 +772,10 @@
           <w:sz w:val="24"/>
           <w:szCs w:val="24"/>
         </w:rPr>
-        <w:tab/>
-      </w:r>
+        <w:t>matplotlib.pyplot</w:t>
+      </w:r>
+      <w:proofErr w:type="spellEnd"/>
+      <w:proofErr w:type="gramEnd"/>
       <w:r>
         <w:rPr>
           <w:rStyle w:val="HTMLCode"/>
@@ -757,7 +785,7 @@
           <w:sz w:val="24"/>
           <w:szCs w:val="24"/>
         </w:rPr>
-        <w:t xml:space="preserve">import </w:t>
+        <w:t xml:space="preserve"> as </w:t>
       </w:r>
       <w:proofErr w:type="spellStart"/>
       <w:r>
@@ -769,10 +797,13 @@
           <w:sz w:val="24"/>
           <w:szCs w:val="24"/>
         </w:rPr>
-        <w:t>matplotlib.pyplot</w:t>
-      </w:r>
-      <w:proofErr w:type="spellEnd"/>
-      <w:r>
+        <w:t>plt</w:t>
+      </w:r>
+      <w:proofErr w:type="spellEnd"/>
+    </w:p>
+    <w:p>
+      <w:pPr>
+        <w:pStyle w:val="HTMLPreformatted"/>
         <w:rPr>
           <w:rStyle w:val="HTMLCode"/>
           <w:rFonts w:ascii="Aptos" w:eastAsiaTheme="majorEastAsia" w:hAnsi="Aptos"/>
@@ -781,9 +812,7 @@
           <w:sz w:val="24"/>
           <w:szCs w:val="24"/>
         </w:rPr>
-        <w:t xml:space="preserve"> as </w:t>
-      </w:r>
-      <w:proofErr w:type="spellStart"/>
+      </w:pPr>
       <w:r>
         <w:rPr>
           <w:rStyle w:val="HTMLCode"/>
@@ -793,13 +822,11 @@
           <w:sz w:val="24"/>
           <w:szCs w:val="24"/>
         </w:rPr>
-        <w:t>plt</w:t>
-      </w:r>
-      <w:proofErr w:type="spellEnd"/>
-    </w:p>
-    <w:p>
-      <w:pPr>
-        <w:pStyle w:val="HTMLPreformatted"/>
+        <w:tab/>
+        <w:t xml:space="preserve">import seaborn as </w:t>
+      </w:r>
+      <w:proofErr w:type="spellStart"/>
+      <w:r>
         <w:rPr>
           <w:rStyle w:val="HTMLCode"/>
           <w:rFonts w:ascii="Aptos" w:eastAsiaTheme="majorEastAsia" w:hAnsi="Aptos"/>
@@ -808,8 +835,13 @@
           <w:sz w:val="24"/>
           <w:szCs w:val="24"/>
         </w:rPr>
-      </w:pPr>
-      <w:r>
+        <w:t>sns</w:t>
+      </w:r>
+      <w:proofErr w:type="spellEnd"/>
+    </w:p>
+    <w:p>
+      <w:pPr>
+        <w:pStyle w:val="HTMLPreformatted"/>
         <w:rPr>
           <w:rStyle w:val="HTMLCode"/>
           <w:rFonts w:ascii="Aptos" w:eastAsiaTheme="majorEastAsia" w:hAnsi="Aptos"/>
@@ -818,9 +850,11 @@
           <w:sz w:val="24"/>
           <w:szCs w:val="24"/>
         </w:rPr>
-        <w:tab/>
-      </w:r>
-      <w:r>
+      </w:pPr>
+    </w:p>
+    <w:p>
+      <w:pPr>
+        <w:pStyle w:val="HTMLPreformatted"/>
         <w:rPr>
           <w:rStyle w:val="HTMLCode"/>
           <w:rFonts w:ascii="Aptos" w:eastAsiaTheme="majorEastAsia" w:hAnsi="Aptos"/>
@@ -829,9 +863,7 @@
           <w:sz w:val="24"/>
           <w:szCs w:val="24"/>
         </w:rPr>
-        <w:t xml:space="preserve">import seaborn as </w:t>
-      </w:r>
-      <w:proofErr w:type="spellStart"/>
+      </w:pPr>
       <w:r>
         <w:rPr>
           <w:rStyle w:val="HTMLCode"/>
@@ -841,13 +873,10 @@
           <w:sz w:val="24"/>
           <w:szCs w:val="24"/>
         </w:rPr>
-        <w:t>sns</w:t>
-      </w:r>
-      <w:proofErr w:type="spellEnd"/>
-    </w:p>
-    <w:p>
-      <w:pPr>
-        <w:pStyle w:val="HTMLPreformatted"/>
+        <w:tab/>
+      </w:r>
+      <w:proofErr w:type="spellStart"/>
+      <w:r>
         <w:rPr>
           <w:rStyle w:val="HTMLCode"/>
           <w:rFonts w:ascii="Aptos" w:eastAsiaTheme="majorEastAsia" w:hAnsi="Aptos"/>
@@ -856,11 +885,10 @@
           <w:sz w:val="24"/>
           <w:szCs w:val="24"/>
         </w:rPr>
-      </w:pPr>
-    </w:p>
-    <w:p>
-      <w:pPr>
-        <w:pStyle w:val="HTMLPreformatted"/>
+        <w:t>pd.set_</w:t>
+      </w:r>
+      <w:proofErr w:type="gramStart"/>
+      <w:r>
         <w:rPr>
           <w:rStyle w:val="HTMLCode"/>
           <w:rFonts w:ascii="Aptos" w:eastAsiaTheme="majorEastAsia" w:hAnsi="Aptos"/>
@@ -869,7 +897,9 @@
           <w:sz w:val="24"/>
           <w:szCs w:val="24"/>
         </w:rPr>
-      </w:pPr>
+        <w:t>option</w:t>
+      </w:r>
+      <w:proofErr w:type="spellEnd"/>
       <w:r>
         <w:rPr>
           <w:rStyle w:val="HTMLCode"/>
@@ -879,9 +909,9 @@
           <w:sz w:val="24"/>
           <w:szCs w:val="24"/>
         </w:rPr>
-        <w:tab/>
-      </w:r>
-      <w:proofErr w:type="spellStart"/>
+        <w:t>(</w:t>
+      </w:r>
+      <w:proofErr w:type="gramEnd"/>
       <w:r>
         <w:rPr>
           <w:rStyle w:val="HTMLCode"/>
@@ -891,9 +921,9 @@
           <w:sz w:val="24"/>
           <w:szCs w:val="24"/>
         </w:rPr>
-        <w:t>pd.set_option</w:t>
-      </w:r>
-      <w:proofErr w:type="spellEnd"/>
+        <w:t>"</w:t>
+      </w:r>
+      <w:proofErr w:type="spellStart"/>
       <w:r>
         <w:rPr>
           <w:rStyle w:val="HTMLCode"/>
@@ -903,9 +933,9 @@
           <w:sz w:val="24"/>
           <w:szCs w:val="24"/>
         </w:rPr>
-        <w:t>("</w:t>
-      </w:r>
-      <w:proofErr w:type="spellStart"/>
+        <w:t>display.max_columns</w:t>
+      </w:r>
+      <w:proofErr w:type="spellEnd"/>
       <w:r>
         <w:rPr>
           <w:rStyle w:val="HTMLCode"/>
@@ -915,9 +945,18 @@
           <w:sz w:val="24"/>
           <w:szCs w:val="24"/>
         </w:rPr>
-        <w:t>display.max_columns</w:t>
-      </w:r>
-      <w:proofErr w:type="spellEnd"/>
+        <w:t>", None)</w:t>
+      </w:r>
+    </w:p>
+    <w:p>
+      <w:pPr>
+        <w:pStyle w:val="HTMLPreformatted"/>
+        <w:rPr>
+          <w:rFonts w:ascii="Aptos" w:hAnsi="Aptos"/>
+          <w:sz w:val="24"/>
+          <w:szCs w:val="24"/>
+        </w:rPr>
+      </w:pPr>
       <w:r>
         <w:rPr>
           <w:rStyle w:val="HTMLCode"/>
@@ -927,18 +966,21 @@
           <w:sz w:val="24"/>
           <w:szCs w:val="24"/>
         </w:rPr>
-        <w:t>", None)</w:t>
-      </w:r>
-    </w:p>
-    <w:p>
-      <w:pPr>
-        <w:pStyle w:val="HTMLPreformatted"/>
-        <w:rPr>
-          <w:rFonts w:ascii="Aptos" w:hAnsi="Aptos"/>
+        <w:tab/>
+      </w:r>
+      <w:proofErr w:type="spellStart"/>
+      <w:r>
+        <w:rPr>
+          <w:rStyle w:val="HTMLCode"/>
+          <w:rFonts w:ascii="Aptos" w:eastAsiaTheme="majorEastAsia" w:hAnsi="Aptos"/>
+          <w:b/>
+          <w:bCs/>
           <w:sz w:val="24"/>
           <w:szCs w:val="24"/>
         </w:rPr>
-      </w:pPr>
+        <w:t>pd.set_</w:t>
+      </w:r>
+      <w:proofErr w:type="gramStart"/>
       <w:r>
         <w:rPr>
           <w:rStyle w:val="HTMLCode"/>
@@ -948,9 +990,9 @@
           <w:sz w:val="24"/>
           <w:szCs w:val="24"/>
         </w:rPr>
-        <w:tab/>
-      </w:r>
-      <w:proofErr w:type="spellStart"/>
+        <w:t>option</w:t>
+      </w:r>
+      <w:proofErr w:type="spellEnd"/>
       <w:r>
         <w:rPr>
           <w:rStyle w:val="HTMLCode"/>
@@ -960,9 +1002,9 @@
           <w:sz w:val="24"/>
           <w:szCs w:val="24"/>
         </w:rPr>
-        <w:t>pd.set_option</w:t>
-      </w:r>
-      <w:proofErr w:type="spellEnd"/>
+        <w:t>(</w:t>
+      </w:r>
+      <w:proofErr w:type="gramEnd"/>
       <w:r>
         <w:rPr>
           <w:rStyle w:val="HTMLCode"/>
@@ -972,7 +1014,7 @@
           <w:sz w:val="24"/>
           <w:szCs w:val="24"/>
         </w:rPr>
-        <w:t>("</w:t>
+        <w:t>"</w:t>
       </w:r>
       <w:proofErr w:type="spellStart"/>
       <w:r>
@@ -1058,6 +1100,7 @@
         <w:t xml:space="preserve"> = </w:t>
       </w:r>
       <w:proofErr w:type="spellStart"/>
+      <w:proofErr w:type="gramStart"/>
       <w:r>
         <w:rPr>
           <w:rStyle w:val="HTMLCode"/>
@@ -1067,9 +1110,9 @@
           <w:sz w:val="24"/>
           <w:szCs w:val="24"/>
         </w:rPr>
-        <w:t>pd.read_csv</w:t>
-      </w:r>
-      <w:proofErr w:type="spellEnd"/>
+        <w:t>pd.read</w:t>
+      </w:r>
+      <w:proofErr w:type="gramEnd"/>
       <w:r>
         <w:rPr>
           <w:rStyle w:val="HTMLCode"/>
@@ -1079,23 +1122,9 @@
           <w:sz w:val="24"/>
           <w:szCs w:val="24"/>
         </w:rPr>
-        <w:t>("diabetes_risk.csv")</w:t>
-      </w:r>
-    </w:p>
-    <w:p>
-      <w:pPr>
-        <w:pStyle w:val="isselectedend"/>
-        <w:rPr>
-          <w:rFonts w:ascii="Aptos" w:hAnsi="Aptos"/>
-        </w:rPr>
-      </w:pPr>
-      <w:r>
-        <w:rPr>
-          <w:rFonts w:ascii="Aptos" w:hAnsi="Aptos"/>
-        </w:rPr>
-        <w:t xml:space="preserve">After loading the dataset, I used </w:t>
-      </w:r>
-      <w:proofErr w:type="spellStart"/>
+        <w:t>_csv</w:t>
+      </w:r>
+      <w:proofErr w:type="spellEnd"/>
       <w:r>
         <w:rPr>
           <w:rStyle w:val="HTMLCode"/>
@@ -1105,9 +1134,24 @@
           <w:sz w:val="24"/>
           <w:szCs w:val="24"/>
         </w:rPr>
-        <w:t>df.head</w:t>
-      </w:r>
-      <w:proofErr w:type="spellEnd"/>
+        <w:t>("diabetes_risk.csv")</w:t>
+      </w:r>
+    </w:p>
+    <w:p>
+      <w:pPr>
+        <w:pStyle w:val="isselectedend"/>
+        <w:rPr>
+          <w:rFonts w:ascii="Aptos" w:hAnsi="Aptos"/>
+        </w:rPr>
+      </w:pPr>
+      <w:r>
+        <w:rPr>
+          <w:rFonts w:ascii="Aptos" w:hAnsi="Aptos"/>
+        </w:rPr>
+        <w:t xml:space="preserve">After loading the dataset, I used </w:t>
+      </w:r>
+      <w:proofErr w:type="spellStart"/>
+      <w:proofErr w:type="gramStart"/>
       <w:r>
         <w:rPr>
           <w:rStyle w:val="HTMLCode"/>
@@ -1117,29 +1161,10 @@
           <w:sz w:val="24"/>
           <w:szCs w:val="24"/>
         </w:rPr>
-        <w:t>()</w:t>
-      </w:r>
-      <w:r>
-        <w:rPr>
-          <w:rFonts w:ascii="Aptos" w:hAnsi="Aptos"/>
-        </w:rPr>
-        <w:t xml:space="preserve"> to display the first few records and verify that the data had been loaded correctly.</w:t>
-      </w:r>
-    </w:p>
-    <w:p>
-      <w:pPr>
-        <w:pStyle w:val="NormalWeb"/>
-        <w:rPr>
-          <w:rFonts w:ascii="Aptos" w:hAnsi="Aptos"/>
-        </w:rPr>
-      </w:pPr>
-      <w:r>
-        <w:rPr>
-          <w:rFonts w:ascii="Aptos" w:hAnsi="Aptos"/>
-        </w:rPr>
-        <w:t xml:space="preserve">I also used </w:t>
-      </w:r>
-      <w:proofErr w:type="spellStart"/>
+        <w:t>df.head</w:t>
+      </w:r>
+      <w:proofErr w:type="spellEnd"/>
+      <w:proofErr w:type="gramEnd"/>
       <w:r>
         <w:rPr>
           <w:rStyle w:val="HTMLCode"/>
@@ -1149,9 +1174,43 @@
           <w:sz w:val="24"/>
           <w:szCs w:val="24"/>
         </w:rPr>
+        <w:t>()</w:t>
+      </w:r>
+      <w:r>
+        <w:rPr>
+          <w:rFonts w:ascii="Aptos" w:hAnsi="Aptos"/>
+        </w:rPr>
+        <w:t xml:space="preserve"> to display the first few records and verify that the data had been loaded correctly.</w:t>
+      </w:r>
+    </w:p>
+    <w:p>
+      <w:pPr>
+        <w:pStyle w:val="NormalWeb"/>
+        <w:rPr>
+          <w:rFonts w:ascii="Aptos" w:hAnsi="Aptos"/>
+        </w:rPr>
+      </w:pPr>
+      <w:r>
+        <w:rPr>
+          <w:rFonts w:ascii="Aptos" w:hAnsi="Aptos"/>
+        </w:rPr>
+        <w:t xml:space="preserve">I also used </w:t>
+      </w:r>
+      <w:proofErr w:type="spellStart"/>
+      <w:proofErr w:type="gramStart"/>
+      <w:r>
+        <w:rPr>
+          <w:rStyle w:val="HTMLCode"/>
+          <w:rFonts w:ascii="Aptos" w:eastAsiaTheme="majorEastAsia" w:hAnsi="Aptos"/>
+          <w:b/>
+          <w:bCs/>
+          <w:sz w:val="24"/>
+          <w:szCs w:val="24"/>
+        </w:rPr>
         <w:t>df.tail</w:t>
       </w:r>
       <w:proofErr w:type="spellEnd"/>
+      <w:proofErr w:type="gramEnd"/>
       <w:r>
         <w:rPr>
           <w:rStyle w:val="HTMLCode"/>
@@ -1267,6 +1326,7 @@
         </w:rPr>
       </w:pPr>
       <w:proofErr w:type="spellStart"/>
+      <w:proofErr w:type="gramStart"/>
       <w:r>
         <w:rPr>
           <w:rFonts w:ascii="Aptos" w:hAnsi="Aptos"/>
@@ -1276,6 +1336,7 @@
         <w:t>df.shape</w:t>
       </w:r>
       <w:proofErr w:type="spellEnd"/>
+      <w:proofErr w:type="gramEnd"/>
     </w:p>
     <w:p>
       <w:pPr>
@@ -1353,7 +1414,21 @@
         <w:rPr>
           <w:rFonts w:ascii="Aptos" w:hAnsi="Aptos"/>
         </w:rPr>
-        <w:t>I used df.info() to examine the structure of the dataset:</w:t>
+        <w:t xml:space="preserve">I used </w:t>
+      </w:r>
+      <w:proofErr w:type="gramStart"/>
+      <w:r>
+        <w:rPr>
+          <w:rFonts w:ascii="Aptos" w:hAnsi="Aptos"/>
+        </w:rPr>
+        <w:t>df.info(</w:t>
+      </w:r>
+      <w:proofErr w:type="gramEnd"/>
+      <w:r>
+        <w:rPr>
+          <w:rFonts w:ascii="Aptos" w:hAnsi="Aptos"/>
+        </w:rPr>
+        <w:t>) to examine the structure of the dataset:</w:t>
       </w:r>
     </w:p>
     <w:p>
@@ -1366,13 +1441,23 @@
           <w:bCs/>
         </w:rPr>
       </w:pPr>
-      <w:r>
-        <w:rPr>
-          <w:rFonts w:ascii="Aptos" w:hAnsi="Aptos"/>
-          <w:b/>
-          <w:bCs/>
-        </w:rPr>
-        <w:t>df.info()</w:t>
+      <w:proofErr w:type="gramStart"/>
+      <w:r>
+        <w:rPr>
+          <w:rFonts w:ascii="Aptos" w:hAnsi="Aptos"/>
+          <w:b/>
+          <w:bCs/>
+        </w:rPr>
+        <w:t>df.info(</w:t>
+      </w:r>
+      <w:proofErr w:type="gramEnd"/>
+      <w:r>
+        <w:rPr>
+          <w:rFonts w:ascii="Aptos" w:hAnsi="Aptos"/>
+          <w:b/>
+          <w:bCs/>
+        </w:rPr>
+        <w:t>)</w:t>
       </w:r>
     </w:p>
     <w:p>
@@ -1386,6 +1471,7 @@
       <w:r>
         <w:rPr>
           <w:rFonts w:ascii="Aptos" w:hAnsi="Aptos"/>
+          <w:noProof/>
         </w:rPr>
         <w:drawing>
           <wp:inline distT="0" distB="0" distL="0" distR="0" wp14:anchorId="29590DE2" wp14:editId="58766AB8">
@@ -1403,7 +1489,7 @@
                     <pic:cNvPicPr/>
                   </pic:nvPicPr>
                   <pic:blipFill>
-                    <a:blip r:embed="rId6"/>
+                    <a:blip r:embed="rId5"/>
                     <a:stretch>
                       <a:fillRect/>
                     </a:stretch>
@@ -1458,6 +1544,7 @@
         <w:t xml:space="preserve"> </w:t>
       </w:r>
       <w:proofErr w:type="spellStart"/>
+      <w:proofErr w:type="gramStart"/>
       <w:r>
         <w:rPr>
           <w:rFonts w:ascii="Aptos" w:hAnsi="Aptos"/>
@@ -1467,6 +1554,7 @@
         <w:t>df.dtypes</w:t>
       </w:r>
       <w:proofErr w:type="spellEnd"/>
+      <w:proofErr w:type="gramEnd"/>
       <w:r>
         <w:rPr>
           <w:rFonts w:ascii="Aptos" w:hAnsi="Aptos"/>
@@ -1551,6 +1639,7 @@
         </w:rPr>
       </w:pPr>
       <w:proofErr w:type="spellStart"/>
+      <w:proofErr w:type="gramStart"/>
       <w:r>
         <w:rPr>
           <w:rFonts w:ascii="Aptos" w:hAnsi="Aptos"/>
@@ -1560,6 +1649,7 @@
         <w:t>df.describe</w:t>
       </w:r>
       <w:proofErr w:type="spellEnd"/>
+      <w:proofErr w:type="gramEnd"/>
       <w:r>
         <w:rPr>
           <w:rFonts w:ascii="Aptos" w:hAnsi="Aptos"/>
@@ -1608,6 +1698,7 @@
         </w:rPr>
       </w:pPr>
       <w:proofErr w:type="spellStart"/>
+      <w:proofErr w:type="gramStart"/>
       <w:r>
         <w:rPr>
           <w:rFonts w:ascii="Aptos" w:hAnsi="Aptos"/>
@@ -1617,6 +1708,7 @@
         <w:t>df.nunique</w:t>
       </w:r>
       <w:proofErr w:type="spellEnd"/>
+      <w:proofErr w:type="gramEnd"/>
       <w:r>
         <w:rPr>
           <w:rFonts w:ascii="Aptos" w:hAnsi="Aptos"/>
@@ -1684,23 +1776,43 @@
         <w:t xml:space="preserve"> = </w:t>
       </w:r>
       <w:proofErr w:type="spellStart"/>
-      <w:r>
-        <w:rPr>
-          <w:rFonts w:ascii="Aptos" w:hAnsi="Aptos"/>
-          <w:b/>
-          <w:bCs/>
-        </w:rPr>
-        <w:t>df.select_dtypes</w:t>
-      </w:r>
-      <w:proofErr w:type="spellEnd"/>
-      <w:r>
-        <w:rPr>
-          <w:rFonts w:ascii="Aptos" w:hAnsi="Aptos"/>
-          <w:b/>
-          <w:bCs/>
-        </w:rPr>
-        <w:t>(include="object").columns</w:t>
-      </w:r>
+      <w:proofErr w:type="gramStart"/>
+      <w:r>
+        <w:rPr>
+          <w:rFonts w:ascii="Aptos" w:hAnsi="Aptos"/>
+          <w:b/>
+          <w:bCs/>
+        </w:rPr>
+        <w:t>df.select</w:t>
+      </w:r>
+      <w:proofErr w:type="gramEnd"/>
+      <w:r>
+        <w:rPr>
+          <w:rFonts w:ascii="Aptos" w:hAnsi="Aptos"/>
+          <w:b/>
+          <w:bCs/>
+        </w:rPr>
+        <w:t>_dtypes</w:t>
+      </w:r>
+      <w:proofErr w:type="spellEnd"/>
+      <w:r>
+        <w:rPr>
+          <w:rFonts w:ascii="Aptos" w:hAnsi="Aptos"/>
+          <w:b/>
+          <w:bCs/>
+        </w:rPr>
+        <w:t>(include="object"</w:t>
+      </w:r>
+      <w:proofErr w:type="gramStart"/>
+      <w:r>
+        <w:rPr>
+          <w:rFonts w:ascii="Aptos" w:hAnsi="Aptos"/>
+          <w:b/>
+          <w:bCs/>
+        </w:rPr>
+        <w:t>).columns</w:t>
+      </w:r>
+      <w:proofErr w:type="gramEnd"/>
     </w:p>
     <w:p>
       <w:pPr>
@@ -1751,13 +1863,23 @@
         </w:rPr>
         <w:tab/>
       </w:r>
-      <w:r>
-        <w:rPr>
-          <w:rFonts w:ascii="Aptos" w:hAnsi="Aptos"/>
-          <w:b/>
-          <w:bCs/>
-        </w:rPr>
-        <w:t>print("\n", columns)</w:t>
+      <w:proofErr w:type="gramStart"/>
+      <w:r>
+        <w:rPr>
+          <w:rFonts w:ascii="Aptos" w:hAnsi="Aptos"/>
+          <w:b/>
+          <w:bCs/>
+        </w:rPr>
+        <w:t>print(</w:t>
+      </w:r>
+      <w:proofErr w:type="gramEnd"/>
+      <w:r>
+        <w:rPr>
+          <w:rFonts w:ascii="Aptos" w:hAnsi="Aptos"/>
+          <w:b/>
+          <w:bCs/>
+        </w:rPr>
+        <w:t>"\n", columns)</w:t>
       </w:r>
     </w:p>
     <w:p>
@@ -1929,6 +2051,7 @@
         </w:rPr>
       </w:pPr>
       <w:proofErr w:type="spellStart"/>
+      <w:proofErr w:type="gramStart"/>
       <w:r>
         <w:rPr>
           <w:rFonts w:ascii="Aptos" w:hAnsi="Aptos" w:cstheme="minorHAnsi"/>
@@ -1938,14 +2061,25 @@
         <w:t>df.describe</w:t>
       </w:r>
       <w:proofErr w:type="spellEnd"/>
+      <w:proofErr w:type="gramEnd"/>
       <w:r>
         <w:rPr>
           <w:rFonts w:ascii="Aptos" w:hAnsi="Aptos" w:cstheme="minorHAnsi"/>
           <w:b/>
           <w:bCs/>
         </w:rPr>
-        <w:t>().T</w:t>
-      </w:r>
+        <w:t>(</w:t>
+      </w:r>
+      <w:proofErr w:type="gramStart"/>
+      <w:r>
+        <w:rPr>
+          <w:rFonts w:ascii="Aptos" w:hAnsi="Aptos" w:cstheme="minorHAnsi"/>
+          <w:b/>
+          <w:bCs/>
+        </w:rPr>
+        <w:t>).T</w:t>
+      </w:r>
+      <w:proofErr w:type="gramEnd"/>
     </w:p>
     <w:p>
       <w:pPr>
@@ -1985,21 +2119,31 @@
           <w:bCs/>
         </w:rPr>
       </w:pPr>
+      <w:proofErr w:type="gramStart"/>
       <w:r>
         <w:rPr>
           <w:rFonts w:ascii="Aptos" w:hAnsi="Aptos" w:cstheme="minorHAnsi"/>
           <w:b/>
           <w:bCs/>
         </w:rPr>
-        <w:t xml:space="preserve">print("Age Range", </w:t>
-      </w:r>
-      <w:proofErr w:type="spellStart"/>
+        <w:t>print(</w:t>
+      </w:r>
+      <w:proofErr w:type="gramEnd"/>
       <w:r>
         <w:rPr>
           <w:rFonts w:ascii="Aptos" w:hAnsi="Aptos" w:cstheme="minorHAnsi"/>
           <w:b/>
           <w:bCs/>
         </w:rPr>
+        <w:t xml:space="preserve">"Age Range", </w:t>
+      </w:r>
+      <w:proofErr w:type="spellStart"/>
+      <w:r>
+        <w:rPr>
+          <w:rFonts w:ascii="Aptos" w:hAnsi="Aptos" w:cstheme="minorHAnsi"/>
+          <w:b/>
+          <w:bCs/>
+        </w:rPr>
         <w:t>df</w:t>
       </w:r>
       <w:proofErr w:type="spellEnd"/>
@@ -2009,15 +2153,33 @@
           <w:b/>
           <w:bCs/>
         </w:rPr>
-        <w:t xml:space="preserve">["age"].min(), "-", </w:t>
-      </w:r>
-      <w:proofErr w:type="spellStart"/>
+        <w:t>["age"</w:t>
+      </w:r>
+      <w:proofErr w:type="gramStart"/>
       <w:r>
         <w:rPr>
           <w:rFonts w:ascii="Aptos" w:hAnsi="Aptos" w:cstheme="minorHAnsi"/>
           <w:b/>
           <w:bCs/>
         </w:rPr>
+        <w:t>].min</w:t>
+      </w:r>
+      <w:proofErr w:type="gramEnd"/>
+      <w:r>
+        <w:rPr>
+          <w:rFonts w:ascii="Aptos" w:hAnsi="Aptos" w:cstheme="minorHAnsi"/>
+          <w:b/>
+          <w:bCs/>
+        </w:rPr>
+        <w:t xml:space="preserve">(), "-", </w:t>
+      </w:r>
+      <w:proofErr w:type="spellStart"/>
+      <w:r>
+        <w:rPr>
+          <w:rFonts w:ascii="Aptos" w:hAnsi="Aptos" w:cstheme="minorHAnsi"/>
+          <w:b/>
+          <w:bCs/>
+        </w:rPr>
         <w:t>df</w:t>
       </w:r>
       <w:proofErr w:type="spellEnd"/>
@@ -2027,7 +2189,25 @@
           <w:b/>
           <w:bCs/>
         </w:rPr>
-        <w:t>["age"].max())</w:t>
+        <w:t>["age"].</w:t>
+      </w:r>
+      <w:proofErr w:type="gramStart"/>
+      <w:r>
+        <w:rPr>
+          <w:rFonts w:ascii="Aptos" w:hAnsi="Aptos" w:cstheme="minorHAnsi"/>
+          <w:b/>
+          <w:bCs/>
+        </w:rPr>
+        <w:t>max(</w:t>
+      </w:r>
+      <w:proofErr w:type="gramEnd"/>
+      <w:r>
+        <w:rPr>
+          <w:rFonts w:ascii="Aptos" w:hAnsi="Aptos" w:cstheme="minorHAnsi"/>
+          <w:b/>
+          <w:bCs/>
+        </w:rPr>
+        <w:t>))</w:t>
       </w:r>
     </w:p>
     <w:p>
@@ -2040,21 +2220,31 @@
           <w:bCs/>
         </w:rPr>
       </w:pPr>
+      <w:proofErr w:type="gramStart"/>
       <w:r>
         <w:rPr>
           <w:rFonts w:ascii="Aptos" w:hAnsi="Aptos" w:cstheme="minorHAnsi"/>
           <w:b/>
           <w:bCs/>
         </w:rPr>
-        <w:t xml:space="preserve">print("BMI Range", </w:t>
-      </w:r>
-      <w:proofErr w:type="spellStart"/>
+        <w:t>print(</w:t>
+      </w:r>
+      <w:proofErr w:type="gramEnd"/>
       <w:r>
         <w:rPr>
           <w:rFonts w:ascii="Aptos" w:hAnsi="Aptos" w:cstheme="minorHAnsi"/>
           <w:b/>
           <w:bCs/>
         </w:rPr>
+        <w:t xml:space="preserve">"BMI Range", </w:t>
+      </w:r>
+      <w:proofErr w:type="spellStart"/>
+      <w:r>
+        <w:rPr>
+          <w:rFonts w:ascii="Aptos" w:hAnsi="Aptos" w:cstheme="minorHAnsi"/>
+          <w:b/>
+          <w:bCs/>
+        </w:rPr>
         <w:t>df</w:t>
       </w:r>
       <w:proofErr w:type="spellEnd"/>
@@ -2082,15 +2272,33 @@
           <w:b/>
           <w:bCs/>
         </w:rPr>
-        <w:t xml:space="preserve">"].min(), "-", </w:t>
-      </w:r>
-      <w:proofErr w:type="spellStart"/>
+        <w:t>"</w:t>
+      </w:r>
+      <w:proofErr w:type="gramStart"/>
       <w:r>
         <w:rPr>
           <w:rFonts w:ascii="Aptos" w:hAnsi="Aptos" w:cstheme="minorHAnsi"/>
           <w:b/>
           <w:bCs/>
         </w:rPr>
+        <w:t>].min</w:t>
+      </w:r>
+      <w:proofErr w:type="gramEnd"/>
+      <w:r>
+        <w:rPr>
+          <w:rFonts w:ascii="Aptos" w:hAnsi="Aptos" w:cstheme="minorHAnsi"/>
+          <w:b/>
+          <w:bCs/>
+        </w:rPr>
+        <w:t xml:space="preserve">(), "-", </w:t>
+      </w:r>
+      <w:proofErr w:type="spellStart"/>
+      <w:r>
+        <w:rPr>
+          <w:rFonts w:ascii="Aptos" w:hAnsi="Aptos" w:cstheme="minorHAnsi"/>
+          <w:b/>
+          <w:bCs/>
+        </w:rPr>
         <w:t>df</w:t>
       </w:r>
       <w:proofErr w:type="spellEnd"/>
@@ -2118,7 +2326,25 @@
           <w:b/>
           <w:bCs/>
         </w:rPr>
-        <w:t>"].max())</w:t>
+        <w:t>"].</w:t>
+      </w:r>
+      <w:proofErr w:type="gramStart"/>
+      <w:r>
+        <w:rPr>
+          <w:rFonts w:ascii="Aptos" w:hAnsi="Aptos" w:cstheme="minorHAnsi"/>
+          <w:b/>
+          <w:bCs/>
+        </w:rPr>
+        <w:t>max(</w:t>
+      </w:r>
+      <w:proofErr w:type="gramEnd"/>
+      <w:r>
+        <w:rPr>
+          <w:rFonts w:ascii="Aptos" w:hAnsi="Aptos" w:cstheme="minorHAnsi"/>
+          <w:b/>
+          <w:bCs/>
+        </w:rPr>
+        <w:t>))</w:t>
       </w:r>
     </w:p>
     <w:p>
@@ -2129,21 +2355,31 @@
           <w:rFonts w:ascii="Aptos" w:hAnsi="Aptos" w:cstheme="minorHAnsi"/>
         </w:rPr>
       </w:pPr>
+      <w:proofErr w:type="gramStart"/>
       <w:r>
         <w:rPr>
           <w:rFonts w:ascii="Aptos" w:hAnsi="Aptos" w:cstheme="minorHAnsi"/>
           <w:b/>
           <w:bCs/>
         </w:rPr>
-        <w:t xml:space="preserve">print("Sleep Range", </w:t>
-      </w:r>
-      <w:proofErr w:type="spellStart"/>
+        <w:t>print(</w:t>
+      </w:r>
+      <w:proofErr w:type="gramEnd"/>
       <w:r>
         <w:rPr>
           <w:rFonts w:ascii="Aptos" w:hAnsi="Aptos" w:cstheme="minorHAnsi"/>
           <w:b/>
           <w:bCs/>
         </w:rPr>
+        <w:t xml:space="preserve">"Sleep Range", </w:t>
+      </w:r>
+      <w:proofErr w:type="spellStart"/>
+      <w:r>
+        <w:rPr>
+          <w:rFonts w:ascii="Aptos" w:hAnsi="Aptos" w:cstheme="minorHAnsi"/>
+          <w:b/>
+          <w:bCs/>
+        </w:rPr>
         <w:t>df</w:t>
       </w:r>
       <w:proofErr w:type="spellEnd"/>
@@ -2171,15 +2407,33 @@
           <w:b/>
           <w:bCs/>
         </w:rPr>
-        <w:t xml:space="preserve">"].min(), "-", </w:t>
-      </w:r>
-      <w:proofErr w:type="spellStart"/>
+        <w:t>"</w:t>
+      </w:r>
+      <w:proofErr w:type="gramStart"/>
       <w:r>
         <w:rPr>
           <w:rFonts w:ascii="Aptos" w:hAnsi="Aptos" w:cstheme="minorHAnsi"/>
           <w:b/>
           <w:bCs/>
         </w:rPr>
+        <w:t>].min</w:t>
+      </w:r>
+      <w:proofErr w:type="gramEnd"/>
+      <w:r>
+        <w:rPr>
+          <w:rFonts w:ascii="Aptos" w:hAnsi="Aptos" w:cstheme="minorHAnsi"/>
+          <w:b/>
+          <w:bCs/>
+        </w:rPr>
+        <w:t xml:space="preserve">(), "-", </w:t>
+      </w:r>
+      <w:proofErr w:type="spellStart"/>
+      <w:r>
+        <w:rPr>
+          <w:rFonts w:ascii="Aptos" w:hAnsi="Aptos" w:cstheme="minorHAnsi"/>
+          <w:b/>
+          <w:bCs/>
+        </w:rPr>
         <w:t>df</w:t>
       </w:r>
       <w:proofErr w:type="spellEnd"/>
@@ -2207,7 +2461,25 @@
           <w:b/>
           <w:bCs/>
         </w:rPr>
-        <w:t>"].max())</w:t>
+        <w:t>"].</w:t>
+      </w:r>
+      <w:proofErr w:type="gramStart"/>
+      <w:r>
+        <w:rPr>
+          <w:rFonts w:ascii="Aptos" w:hAnsi="Aptos" w:cstheme="minorHAnsi"/>
+          <w:b/>
+          <w:bCs/>
+        </w:rPr>
+        <w:t>max(</w:t>
+      </w:r>
+      <w:proofErr w:type="gramEnd"/>
+      <w:r>
+        <w:rPr>
+          <w:rFonts w:ascii="Aptos" w:hAnsi="Aptos" w:cstheme="minorHAnsi"/>
+          <w:b/>
+          <w:bCs/>
+        </w:rPr>
+        <w:t>))</w:t>
       </w:r>
     </w:p>
     <w:p>
@@ -2380,6 +2652,7 @@
         <w:t xml:space="preserve">missing = </w:t>
       </w:r>
       <w:proofErr w:type="spellStart"/>
+      <w:proofErr w:type="gramStart"/>
       <w:r>
         <w:rPr>
           <w:rFonts w:ascii="Aptos" w:eastAsia="Times New Roman" w:hAnsi="Aptos" w:cs="Courier New"/>
@@ -2392,6 +2665,7 @@
         <w:t>df.isnull</w:t>
       </w:r>
       <w:proofErr w:type="spellEnd"/>
+      <w:proofErr w:type="gramEnd"/>
       <w:r>
         <w:rPr>
           <w:rFonts w:ascii="Aptos" w:eastAsia="Times New Roman" w:hAnsi="Aptos" w:cs="Courier New"/>
@@ -2401,7 +2675,31 @@
           <w:lang w:eastAsia="en-IN"/>
           <w14:ligatures w14:val="none"/>
         </w:rPr>
-        <w:t>().sum()</w:t>
+        <w:t>(</w:t>
+      </w:r>
+      <w:proofErr w:type="gramStart"/>
+      <w:r>
+        <w:rPr>
+          <w:rFonts w:ascii="Aptos" w:eastAsia="Times New Roman" w:hAnsi="Aptos" w:cs="Courier New"/>
+          <w:b/>
+          <w:bCs/>
+          <w:kern w:val="0"/>
+          <w:lang w:eastAsia="en-IN"/>
+          <w14:ligatures w14:val="none"/>
+        </w:rPr>
+        <w:t>).sum</w:t>
+      </w:r>
+      <w:proofErr w:type="gramEnd"/>
+      <w:r>
+        <w:rPr>
+          <w:rFonts w:ascii="Aptos" w:eastAsia="Times New Roman" w:hAnsi="Aptos" w:cs="Courier New"/>
+          <w:b/>
+          <w:bCs/>
+          <w:kern w:val="0"/>
+          <w:lang w:eastAsia="en-IN"/>
+          <w14:ligatures w14:val="none"/>
+        </w:rPr>
+        <w:t>()</w:t>
       </w:r>
     </w:p>
     <w:p>
@@ -2445,6 +2743,7 @@
         </w:rPr>
         <w:tab/>
       </w:r>
+      <w:proofErr w:type="gramStart"/>
       <w:r>
         <w:rPr>
           <w:rFonts w:ascii="Aptos" w:eastAsia="Times New Roman" w:hAnsi="Aptos" w:cs="Courier New"/>
@@ -2454,7 +2753,19 @@
           <w:lang w:eastAsia="en-IN"/>
           <w14:ligatures w14:val="none"/>
         </w:rPr>
-        <w:t>missing[missing &gt; 0]</w:t>
+        <w:t>missing[</w:t>
+      </w:r>
+      <w:proofErr w:type="gramEnd"/>
+      <w:r>
+        <w:rPr>
+          <w:rFonts w:ascii="Aptos" w:eastAsia="Times New Roman" w:hAnsi="Aptos" w:cs="Courier New"/>
+          <w:b/>
+          <w:bCs/>
+          <w:kern w:val="0"/>
+          <w:lang w:eastAsia="en-IN"/>
+          <w14:ligatures w14:val="none"/>
+        </w:rPr>
+        <w:t>missing &gt; 0]</w:t>
       </w:r>
     </w:p>
     <w:p>
@@ -2490,6 +2801,7 @@
       <w:r>
         <w:rPr>
           <w:rFonts w:ascii="Aptos" w:eastAsia="Times New Roman" w:hAnsi="Aptos" w:cs="Times New Roman"/>
+          <w:noProof/>
           <w:kern w:val="0"/>
           <w:lang w:eastAsia="en-IN"/>
           <w14:ligatures w14:val="none"/>
@@ -2518,7 +2830,7 @@
                     <pic:cNvPicPr/>
                   </pic:nvPicPr>
                   <pic:blipFill>
-                    <a:blip r:embed="rId7">
+                    <a:blip r:embed="rId6">
                       <a:extLst>
                         <a:ext uri="{28A0092B-C50C-407E-A947-70E740481C1C}">
                           <a14:useLocalDpi xmlns:a14="http://schemas.microsoft.com/office/drawing/2010/main" val="0"/>
@@ -2649,6 +2961,7 @@
         <w:t xml:space="preserve"> = </w:t>
       </w:r>
       <w:proofErr w:type="spellStart"/>
+      <w:proofErr w:type="gramStart"/>
       <w:r>
         <w:rPr>
           <w:rFonts w:ascii="Aptos" w:eastAsia="Times New Roman" w:hAnsi="Aptos" w:cs="Courier New"/>
@@ -2661,6 +2974,7 @@
         <w:t>pd.DataFrame</w:t>
       </w:r>
       <w:proofErr w:type="spellEnd"/>
+      <w:proofErr w:type="gramEnd"/>
       <w:r>
         <w:rPr>
           <w:rFonts w:ascii="Aptos" w:eastAsia="Times New Roman" w:hAnsi="Aptos" w:cs="Courier New"/>
@@ -2737,6 +3051,7 @@
         <w:t xml:space="preserve">"Missing Count": </w:t>
       </w:r>
       <w:proofErr w:type="spellStart"/>
+      <w:proofErr w:type="gramStart"/>
       <w:r>
         <w:rPr>
           <w:rFonts w:ascii="Aptos" w:eastAsia="Times New Roman" w:hAnsi="Aptos" w:cs="Courier New"/>
@@ -2749,6 +3064,7 @@
         <w:t>df.isnull</w:t>
       </w:r>
       <w:proofErr w:type="spellEnd"/>
+      <w:proofErr w:type="gramEnd"/>
       <w:r>
         <w:rPr>
           <w:rFonts w:ascii="Aptos" w:eastAsia="Times New Roman" w:hAnsi="Aptos" w:cs="Courier New"/>
@@ -2758,7 +3074,31 @@
           <w:lang w:eastAsia="en-IN"/>
           <w14:ligatures w14:val="none"/>
         </w:rPr>
-        <w:t>().sum(),</w:t>
+        <w:t>(</w:t>
+      </w:r>
+      <w:proofErr w:type="gramStart"/>
+      <w:r>
+        <w:rPr>
+          <w:rFonts w:ascii="Aptos" w:eastAsia="Times New Roman" w:hAnsi="Aptos" w:cs="Courier New"/>
+          <w:b/>
+          <w:bCs/>
+          <w:kern w:val="0"/>
+          <w:lang w:eastAsia="en-IN"/>
+          <w14:ligatures w14:val="none"/>
+        </w:rPr>
+        <w:t>).sum</w:t>
+      </w:r>
+      <w:proofErr w:type="gramEnd"/>
+      <w:r>
+        <w:rPr>
+          <w:rFonts w:ascii="Aptos" w:eastAsia="Times New Roman" w:hAnsi="Aptos" w:cs="Courier New"/>
+          <w:b/>
+          <w:bCs/>
+          <w:kern w:val="0"/>
+          <w:lang w:eastAsia="en-IN"/>
+          <w14:ligatures w14:val="none"/>
+        </w:rPr>
+        <w:t>(),</w:t>
       </w:r>
     </w:p>
     <w:p>
@@ -2825,6 +3165,7 @@
         <w:t>"Missing Percentage": (</w:t>
       </w:r>
       <w:proofErr w:type="spellStart"/>
+      <w:proofErr w:type="gramStart"/>
       <w:r>
         <w:rPr>
           <w:rFonts w:ascii="Aptos" w:eastAsia="Times New Roman" w:hAnsi="Aptos" w:cs="Courier New"/>
@@ -2837,6 +3178,7 @@
         <w:t>df.isnull</w:t>
       </w:r>
       <w:proofErr w:type="spellEnd"/>
+      <w:proofErr w:type="gramEnd"/>
       <w:r>
         <w:rPr>
           <w:rFonts w:ascii="Aptos" w:eastAsia="Times New Roman" w:hAnsi="Aptos" w:cs="Courier New"/>
@@ -2846,7 +3188,31 @@
           <w:lang w:eastAsia="en-IN"/>
           <w14:ligatures w14:val="none"/>
         </w:rPr>
-        <w:t xml:space="preserve">().sum() / </w:t>
+        <w:t>(</w:t>
+      </w:r>
+      <w:proofErr w:type="gramStart"/>
+      <w:r>
+        <w:rPr>
+          <w:rFonts w:ascii="Aptos" w:eastAsia="Times New Roman" w:hAnsi="Aptos" w:cs="Courier New"/>
+          <w:b/>
+          <w:bCs/>
+          <w:kern w:val="0"/>
+          <w:lang w:eastAsia="en-IN"/>
+          <w14:ligatures w14:val="none"/>
+        </w:rPr>
+        <w:t>).sum</w:t>
+      </w:r>
+      <w:proofErr w:type="gramEnd"/>
+      <w:r>
+        <w:rPr>
+          <w:rFonts w:ascii="Aptos" w:eastAsia="Times New Roman" w:hAnsi="Aptos" w:cs="Courier New"/>
+          <w:b/>
+          <w:bCs/>
+          <w:kern w:val="0"/>
+          <w:lang w:eastAsia="en-IN"/>
+          <w14:ligatures w14:val="none"/>
+        </w:rPr>
+        <w:t xml:space="preserve">() / </w:t>
       </w:r>
       <w:proofErr w:type="spellStart"/>
       <w:r>
@@ -2937,16 +3303,6 @@
           <w14:ligatures w14:val="none"/>
         </w:rPr>
         <w:tab/>
-      </w:r>
-      <w:r>
-        <w:rPr>
-          <w:rFonts w:ascii="Aptos" w:eastAsia="Times New Roman" w:hAnsi="Aptos" w:cs="Courier New"/>
-          <w:b/>
-          <w:bCs/>
-          <w:kern w:val="0"/>
-          <w:lang w:eastAsia="en-IN"/>
-          <w14:ligatures w14:val="none"/>
-        </w:rPr>
         <w:t>})</w:t>
       </w:r>
     </w:p>
@@ -3056,9 +3412,9 @@
           <w:lang w:eastAsia="en-IN"/>
           <w14:ligatures w14:val="none"/>
         </w:rPr>
-        <w:t>missing_summary</w:t>
-      </w:r>
-      <w:proofErr w:type="spellEnd"/>
+        <w:t>missing_</w:t>
+      </w:r>
+      <w:proofErr w:type="gramStart"/>
       <w:r>
         <w:rPr>
           <w:rFonts w:ascii="Aptos" w:eastAsia="Times New Roman" w:hAnsi="Aptos" w:cs="Courier New"/>
@@ -3068,8 +3424,21 @@
           <w:lang w:eastAsia="en-IN"/>
           <w14:ligatures w14:val="none"/>
         </w:rPr>
+        <w:t>summary</w:t>
+      </w:r>
+      <w:proofErr w:type="spellEnd"/>
+      <w:r>
+        <w:rPr>
+          <w:rFonts w:ascii="Aptos" w:eastAsia="Times New Roman" w:hAnsi="Aptos" w:cs="Courier New"/>
+          <w:b/>
+          <w:bCs/>
+          <w:kern w:val="0"/>
+          <w:lang w:eastAsia="en-IN"/>
+          <w14:ligatures w14:val="none"/>
+        </w:rPr>
         <w:t>[</w:t>
       </w:r>
+      <w:proofErr w:type="gramEnd"/>
     </w:p>
     <w:p>
       <w:pPr>
@@ -3133,9 +3502,9 @@
           <w:lang w:eastAsia="en-IN"/>
           <w14:ligatures w14:val="none"/>
         </w:rPr>
-        <w:t>missing_summary</w:t>
-      </w:r>
-      <w:proofErr w:type="spellEnd"/>
+        <w:t>missing_</w:t>
+      </w:r>
+      <w:proofErr w:type="gramStart"/>
       <w:r>
         <w:rPr>
           <w:rFonts w:ascii="Aptos" w:eastAsia="Times New Roman" w:hAnsi="Aptos" w:cs="Courier New"/>
@@ -3145,7 +3514,31 @@
           <w:lang w:eastAsia="en-IN"/>
           <w14:ligatures w14:val="none"/>
         </w:rPr>
-        <w:t>["Missing Count"] &gt; 0</w:t>
+        <w:t>summary</w:t>
+      </w:r>
+      <w:proofErr w:type="spellEnd"/>
+      <w:r>
+        <w:rPr>
+          <w:rFonts w:ascii="Aptos" w:eastAsia="Times New Roman" w:hAnsi="Aptos" w:cs="Courier New"/>
+          <w:b/>
+          <w:bCs/>
+          <w:kern w:val="0"/>
+          <w:lang w:eastAsia="en-IN"/>
+          <w14:ligatures w14:val="none"/>
+        </w:rPr>
+        <w:t>[</w:t>
+      </w:r>
+      <w:proofErr w:type="gramEnd"/>
+      <w:r>
+        <w:rPr>
+          <w:rFonts w:ascii="Aptos" w:eastAsia="Times New Roman" w:hAnsi="Aptos" w:cs="Courier New"/>
+          <w:b/>
+          <w:bCs/>
+          <w:kern w:val="0"/>
+          <w:lang w:eastAsia="en-IN"/>
+          <w14:ligatures w14:val="none"/>
+        </w:rPr>
+        <w:t>"Missing Count"] &gt; 0</w:t>
       </w:r>
     </w:p>
     <w:p>
@@ -3188,16 +3581,6 @@
           <w14:ligatures w14:val="none"/>
         </w:rPr>
         <w:tab/>
-      </w:r>
-      <w:r>
-        <w:rPr>
-          <w:rFonts w:ascii="Aptos" w:eastAsia="Times New Roman" w:hAnsi="Aptos" w:cs="Courier New"/>
-          <w:b/>
-          <w:bCs/>
-          <w:kern w:val="0"/>
-          <w:lang w:eastAsia="en-IN"/>
-          <w14:ligatures w14:val="none"/>
-        </w:rPr>
         <w:t>]</w:t>
       </w:r>
     </w:p>
@@ -3330,6 +3713,7 @@
         <w:t xml:space="preserve"> = </w:t>
       </w:r>
       <w:proofErr w:type="spellStart"/>
+      <w:proofErr w:type="gramStart"/>
       <w:r>
         <w:rPr>
           <w:rFonts w:ascii="Aptos" w:eastAsia="Times New Roman" w:hAnsi="Aptos" w:cs="Times New Roman"/>
@@ -3342,16 +3726,41 @@
         <w:t>df.duplicated</w:t>
       </w:r>
       <w:proofErr w:type="spellEnd"/>
-      <w:r>
-        <w:rPr>
-          <w:rFonts w:ascii="Aptos" w:eastAsia="Times New Roman" w:hAnsi="Aptos" w:cs="Times New Roman"/>
-          <w:b/>
-          <w:bCs/>
-          <w:kern w:val="0"/>
-          <w:lang w:eastAsia="en-IN"/>
-          <w14:ligatures w14:val="none"/>
-        </w:rPr>
-        <w:t>().sum()</w:t>
+      <w:proofErr w:type="gramEnd"/>
+      <w:r>
+        <w:rPr>
+          <w:rFonts w:ascii="Aptos" w:eastAsia="Times New Roman" w:hAnsi="Aptos" w:cs="Times New Roman"/>
+          <w:b/>
+          <w:bCs/>
+          <w:kern w:val="0"/>
+          <w:lang w:eastAsia="en-IN"/>
+          <w14:ligatures w14:val="none"/>
+        </w:rPr>
+        <w:t>(</w:t>
+      </w:r>
+      <w:proofErr w:type="gramStart"/>
+      <w:r>
+        <w:rPr>
+          <w:rFonts w:ascii="Aptos" w:eastAsia="Times New Roman" w:hAnsi="Aptos" w:cs="Times New Roman"/>
+          <w:b/>
+          <w:bCs/>
+          <w:kern w:val="0"/>
+          <w:lang w:eastAsia="en-IN"/>
+          <w14:ligatures w14:val="none"/>
+        </w:rPr>
+        <w:t>).sum</w:t>
+      </w:r>
+      <w:proofErr w:type="gramEnd"/>
+      <w:r>
+        <w:rPr>
+          <w:rFonts w:ascii="Aptos" w:eastAsia="Times New Roman" w:hAnsi="Aptos" w:cs="Times New Roman"/>
+          <w:b/>
+          <w:bCs/>
+          <w:kern w:val="0"/>
+          <w:lang w:eastAsia="en-IN"/>
+          <w14:ligatures w14:val="none"/>
+        </w:rPr>
+        <w:t>()</w:t>
       </w:r>
     </w:p>
     <w:p>
@@ -3367,16 +3776,29 @@
           <w14:ligatures w14:val="none"/>
         </w:rPr>
       </w:pPr>
-      <w:r>
-        <w:rPr>
-          <w:rFonts w:ascii="Aptos" w:eastAsia="Times New Roman" w:hAnsi="Aptos" w:cs="Times New Roman"/>
-          <w:b/>
-          <w:bCs/>
-          <w:kern w:val="0"/>
-          <w:lang w:eastAsia="en-IN"/>
-          <w14:ligatures w14:val="none"/>
-        </w:rPr>
-        <w:t xml:space="preserve">print("Number of duplicate rows:", </w:t>
+      <w:proofErr w:type="gramStart"/>
+      <w:r>
+        <w:rPr>
+          <w:rFonts w:ascii="Aptos" w:eastAsia="Times New Roman" w:hAnsi="Aptos" w:cs="Times New Roman"/>
+          <w:b/>
+          <w:bCs/>
+          <w:kern w:val="0"/>
+          <w:lang w:eastAsia="en-IN"/>
+          <w14:ligatures w14:val="none"/>
+        </w:rPr>
+        <w:t>print(</w:t>
+      </w:r>
+      <w:proofErr w:type="gramEnd"/>
+      <w:r>
+        <w:rPr>
+          <w:rFonts w:ascii="Aptos" w:eastAsia="Times New Roman" w:hAnsi="Aptos" w:cs="Times New Roman"/>
+          <w:b/>
+          <w:bCs/>
+          <w:kern w:val="0"/>
+          <w:lang w:eastAsia="en-IN"/>
+          <w14:ligatures w14:val="none"/>
+        </w:rPr>
+        <w:t xml:space="preserve">"Number of duplicate rows:", </w:t>
       </w:r>
       <w:proofErr w:type="spellStart"/>
       <w:r>
@@ -3518,16 +3940,29 @@
           <w14:ligatures w14:val="none"/>
         </w:rPr>
       </w:pPr>
-      <w:r>
-        <w:rPr>
-          <w:rFonts w:ascii="Aptos" w:eastAsia="Times New Roman" w:hAnsi="Aptos" w:cs="Times New Roman"/>
-          <w:b/>
-          <w:bCs/>
-          <w:kern w:val="0"/>
-          <w:lang w:eastAsia="en-IN"/>
-          <w14:ligatures w14:val="none"/>
-        </w:rPr>
-        <w:t xml:space="preserve">print("Total records:", </w:t>
+      <w:proofErr w:type="gramStart"/>
+      <w:r>
+        <w:rPr>
+          <w:rFonts w:ascii="Aptos" w:eastAsia="Times New Roman" w:hAnsi="Aptos" w:cs="Times New Roman"/>
+          <w:b/>
+          <w:bCs/>
+          <w:kern w:val="0"/>
+          <w:lang w:eastAsia="en-IN"/>
+          <w14:ligatures w14:val="none"/>
+        </w:rPr>
+        <w:t>print(</w:t>
+      </w:r>
+      <w:proofErr w:type="gramEnd"/>
+      <w:r>
+        <w:rPr>
+          <w:rFonts w:ascii="Aptos" w:eastAsia="Times New Roman" w:hAnsi="Aptos" w:cs="Times New Roman"/>
+          <w:b/>
+          <w:bCs/>
+          <w:kern w:val="0"/>
+          <w:lang w:eastAsia="en-IN"/>
+          <w14:ligatures w14:val="none"/>
+        </w:rPr>
+        <w:t xml:space="preserve">"Total records:", </w:t>
       </w:r>
       <w:proofErr w:type="spellStart"/>
       <w:r>
@@ -3591,16 +4026,29 @@
           <w14:ligatures w14:val="none"/>
         </w:rPr>
       </w:pPr>
-      <w:r>
-        <w:rPr>
-          <w:rFonts w:ascii="Aptos" w:eastAsia="Times New Roman" w:hAnsi="Aptos" w:cs="Times New Roman"/>
-          <w:b/>
-          <w:bCs/>
-          <w:kern w:val="0"/>
-          <w:lang w:eastAsia="en-IN"/>
-          <w14:ligatures w14:val="none"/>
-        </w:rPr>
-        <w:t xml:space="preserve">print("Unique patient IDs:", </w:t>
+      <w:proofErr w:type="gramStart"/>
+      <w:r>
+        <w:rPr>
+          <w:rFonts w:ascii="Aptos" w:eastAsia="Times New Roman" w:hAnsi="Aptos" w:cs="Times New Roman"/>
+          <w:b/>
+          <w:bCs/>
+          <w:kern w:val="0"/>
+          <w:lang w:eastAsia="en-IN"/>
+          <w14:ligatures w14:val="none"/>
+        </w:rPr>
+        <w:t>print(</w:t>
+      </w:r>
+      <w:proofErr w:type="gramEnd"/>
+      <w:r>
+        <w:rPr>
+          <w:rFonts w:ascii="Aptos" w:eastAsia="Times New Roman" w:hAnsi="Aptos" w:cs="Times New Roman"/>
+          <w:b/>
+          <w:bCs/>
+          <w:kern w:val="0"/>
+          <w:lang w:eastAsia="en-IN"/>
+          <w14:ligatures w14:val="none"/>
+        </w:rPr>
+        <w:t xml:space="preserve">"Unique patient IDs:", </w:t>
       </w:r>
       <w:proofErr w:type="spellStart"/>
       <w:r>
@@ -3648,7 +4096,19 @@
           <w:lang w:eastAsia="en-IN"/>
           <w14:ligatures w14:val="none"/>
         </w:rPr>
-        <w:t>"].</w:t>
+        <w:t>"</w:t>
+      </w:r>
+      <w:proofErr w:type="gramStart"/>
+      <w:r>
+        <w:rPr>
+          <w:rFonts w:ascii="Aptos" w:eastAsia="Times New Roman" w:hAnsi="Aptos" w:cs="Times New Roman"/>
+          <w:b/>
+          <w:bCs/>
+          <w:kern w:val="0"/>
+          <w:lang w:eastAsia="en-IN"/>
+          <w14:ligatures w14:val="none"/>
+        </w:rPr>
+        <w:t>].</w:t>
       </w:r>
       <w:proofErr w:type="spellStart"/>
       <w:r>
@@ -3663,6 +4123,7 @@
         <w:t>nunique</w:t>
       </w:r>
       <w:proofErr w:type="spellEnd"/>
+      <w:proofErr w:type="gramEnd"/>
       <w:r>
         <w:rPr>
           <w:rFonts w:ascii="Aptos" w:eastAsia="Times New Roman" w:hAnsi="Aptos" w:cs="Times New Roman"/>
@@ -3689,6 +4150,7 @@
       <w:r>
         <w:rPr>
           <w:rFonts w:ascii="Aptos" w:eastAsia="Times New Roman" w:hAnsi="Aptos" w:cs="Times New Roman"/>
+          <w:noProof/>
           <w:kern w:val="0"/>
           <w:lang w:eastAsia="en-IN"/>
           <w14:ligatures w14:val="none"/>
@@ -3710,7 +4172,7 @@
                     <pic:cNvPicPr/>
                   </pic:nvPicPr>
                   <pic:blipFill>
-                    <a:blip r:embed="rId8"/>
+                    <a:blip r:embed="rId7"/>
                     <a:stretch>
                       <a:fillRect/>
                     </a:stretch>
@@ -3829,17 +4291,37 @@
           <w:lang w:eastAsia="en-IN"/>
           <w14:ligatures w14:val="none"/>
         </w:rPr>
-        <w:t>value_counts</w:t>
-      </w:r>
-      <w:proofErr w:type="spellEnd"/>
-      <w:r>
-        <w:rPr>
-          <w:rFonts w:ascii="Aptos" w:eastAsia="Times New Roman" w:hAnsi="Aptos" w:cs="Times New Roman"/>
-          <w:kern w:val="0"/>
-          <w:lang w:eastAsia="en-IN"/>
-          <w14:ligatures w14:val="none"/>
-        </w:rPr>
-        <w:t>() to understand the categories present in the dataset.</w:t>
+        <w:t>value_</w:t>
+      </w:r>
+      <w:proofErr w:type="gramStart"/>
+      <w:r>
+        <w:rPr>
+          <w:rFonts w:ascii="Aptos" w:eastAsia="Times New Roman" w:hAnsi="Aptos" w:cs="Times New Roman"/>
+          <w:kern w:val="0"/>
+          <w:lang w:eastAsia="en-IN"/>
+          <w14:ligatures w14:val="none"/>
+        </w:rPr>
+        <w:t>counts</w:t>
+      </w:r>
+      <w:proofErr w:type="spellEnd"/>
+      <w:r>
+        <w:rPr>
+          <w:rFonts w:ascii="Aptos" w:eastAsia="Times New Roman" w:hAnsi="Aptos" w:cs="Times New Roman"/>
+          <w:kern w:val="0"/>
+          <w:lang w:eastAsia="en-IN"/>
+          <w14:ligatures w14:val="none"/>
+        </w:rPr>
+        <w:t>(</w:t>
+      </w:r>
+      <w:proofErr w:type="gramEnd"/>
+      <w:r>
+        <w:rPr>
+          <w:rFonts w:ascii="Aptos" w:eastAsia="Times New Roman" w:hAnsi="Aptos" w:cs="Times New Roman"/>
+          <w:kern w:val="0"/>
+          <w:lang w:eastAsia="en-IN"/>
+          <w14:ligatures w14:val="none"/>
+        </w:rPr>
+        <w:t>) to understand the categories present in the dataset.</w:t>
       </w:r>
     </w:p>
     <w:p>
@@ -3880,29 +4362,55 @@
         <w:t xml:space="preserve"> = </w:t>
       </w:r>
       <w:proofErr w:type="spellStart"/>
-      <w:r>
-        <w:rPr>
-          <w:rFonts w:ascii="Aptos" w:eastAsia="Times New Roman" w:hAnsi="Aptos" w:cs="Times New Roman"/>
-          <w:b/>
-          <w:bCs/>
-          <w:kern w:val="0"/>
-          <w:lang w:eastAsia="en-IN"/>
-          <w14:ligatures w14:val="none"/>
-        </w:rPr>
-        <w:t>df.select_dtypes</w:t>
-      </w:r>
-      <w:proofErr w:type="spellEnd"/>
-      <w:r>
-        <w:rPr>
-          <w:rFonts w:ascii="Aptos" w:eastAsia="Times New Roman" w:hAnsi="Aptos" w:cs="Times New Roman"/>
-          <w:b/>
-          <w:bCs/>
-          <w:kern w:val="0"/>
-          <w:lang w:eastAsia="en-IN"/>
-          <w14:ligatures w14:val="none"/>
-        </w:rPr>
-        <w:t>(include="object").columns</w:t>
-      </w:r>
+      <w:proofErr w:type="gramStart"/>
+      <w:r>
+        <w:rPr>
+          <w:rFonts w:ascii="Aptos" w:eastAsia="Times New Roman" w:hAnsi="Aptos" w:cs="Times New Roman"/>
+          <w:b/>
+          <w:bCs/>
+          <w:kern w:val="0"/>
+          <w:lang w:eastAsia="en-IN"/>
+          <w14:ligatures w14:val="none"/>
+        </w:rPr>
+        <w:t>df.select</w:t>
+      </w:r>
+      <w:proofErr w:type="gramEnd"/>
+      <w:r>
+        <w:rPr>
+          <w:rFonts w:ascii="Aptos" w:eastAsia="Times New Roman" w:hAnsi="Aptos" w:cs="Times New Roman"/>
+          <w:b/>
+          <w:bCs/>
+          <w:kern w:val="0"/>
+          <w:lang w:eastAsia="en-IN"/>
+          <w14:ligatures w14:val="none"/>
+        </w:rPr>
+        <w:t>_dtypes</w:t>
+      </w:r>
+      <w:proofErr w:type="spellEnd"/>
+      <w:r>
+        <w:rPr>
+          <w:rFonts w:ascii="Aptos" w:eastAsia="Times New Roman" w:hAnsi="Aptos" w:cs="Times New Roman"/>
+          <w:b/>
+          <w:bCs/>
+          <w:kern w:val="0"/>
+          <w:lang w:eastAsia="en-IN"/>
+          <w14:ligatures w14:val="none"/>
+        </w:rPr>
+        <w:t>(include="object"</w:t>
+      </w:r>
+      <w:proofErr w:type="gramStart"/>
+      <w:r>
+        <w:rPr>
+          <w:rFonts w:ascii="Aptos" w:eastAsia="Times New Roman" w:hAnsi="Aptos" w:cs="Times New Roman"/>
+          <w:b/>
+          <w:bCs/>
+          <w:kern w:val="0"/>
+          <w:lang w:eastAsia="en-IN"/>
+          <w14:ligatures w14:val="none"/>
+        </w:rPr>
+        <w:t>).columns</w:t>
+      </w:r>
+      <w:proofErr w:type="gramEnd"/>
     </w:p>
     <w:p>
       <w:pPr>
@@ -3977,7 +4485,31 @@
           <w:lang w:eastAsia="en-IN"/>
           <w14:ligatures w14:val="none"/>
         </w:rPr>
-        <w:t xml:space="preserve">    print("\n", columns)</w:t>
+        <w:t xml:space="preserve">    </w:t>
+      </w:r>
+      <w:proofErr w:type="gramStart"/>
+      <w:r>
+        <w:rPr>
+          <w:rFonts w:ascii="Aptos" w:eastAsia="Times New Roman" w:hAnsi="Aptos" w:cs="Times New Roman"/>
+          <w:b/>
+          <w:bCs/>
+          <w:kern w:val="0"/>
+          <w:lang w:eastAsia="en-IN"/>
+          <w14:ligatures w14:val="none"/>
+        </w:rPr>
+        <w:t>print(</w:t>
+      </w:r>
+      <w:proofErr w:type="gramEnd"/>
+      <w:r>
+        <w:rPr>
+          <w:rFonts w:ascii="Aptos" w:eastAsia="Times New Roman" w:hAnsi="Aptos" w:cs="Times New Roman"/>
+          <w:b/>
+          <w:bCs/>
+          <w:kern w:val="0"/>
+          <w:lang w:eastAsia="en-IN"/>
+          <w14:ligatures w14:val="none"/>
+        </w:rPr>
+        <w:t>"\n", columns)</w:t>
       </w:r>
     </w:p>
     <w:p>
@@ -4193,6 +4725,7 @@
         </w:rPr>
       </w:pPr>
       <w:proofErr w:type="spellStart"/>
+      <w:proofErr w:type="gramStart"/>
       <w:r>
         <w:rPr>
           <w:rFonts w:ascii="Aptos" w:eastAsia="Times New Roman" w:hAnsi="Aptos" w:cs="Times New Roman"/>
@@ -4205,17 +4738,31 @@
         <w:t>df.describe</w:t>
       </w:r>
       <w:proofErr w:type="spellEnd"/>
-      <w:r>
-        <w:rPr>
-          <w:rFonts w:ascii="Aptos" w:eastAsia="Times New Roman" w:hAnsi="Aptos" w:cs="Times New Roman"/>
-          <w:b/>
-          <w:bCs/>
-          <w:kern w:val="0"/>
-          <w:lang w:eastAsia="en-IN"/>
-          <w14:ligatures w14:val="none"/>
-        </w:rPr>
-        <w:t>().T</w:t>
-      </w:r>
+      <w:proofErr w:type="gramEnd"/>
+      <w:r>
+        <w:rPr>
+          <w:rFonts w:ascii="Aptos" w:eastAsia="Times New Roman" w:hAnsi="Aptos" w:cs="Times New Roman"/>
+          <w:b/>
+          <w:bCs/>
+          <w:kern w:val="0"/>
+          <w:lang w:eastAsia="en-IN"/>
+          <w14:ligatures w14:val="none"/>
+        </w:rPr>
+        <w:t>(</w:t>
+      </w:r>
+      <w:proofErr w:type="gramStart"/>
+      <w:r>
+        <w:rPr>
+          <w:rFonts w:ascii="Aptos" w:eastAsia="Times New Roman" w:hAnsi="Aptos" w:cs="Times New Roman"/>
+          <w:b/>
+          <w:bCs/>
+          <w:kern w:val="0"/>
+          <w:lang w:eastAsia="en-IN"/>
+          <w14:ligatures w14:val="none"/>
+        </w:rPr>
+        <w:t>).T</w:t>
+      </w:r>
+      <w:proofErr w:type="gramEnd"/>
     </w:p>
     <w:p>
       <w:pPr>
@@ -4235,6 +4782,7 @@
           <w:rFonts w:ascii="Aptos" w:eastAsia="Times New Roman" w:hAnsi="Aptos" w:cs="Times New Roman"/>
           <w:b/>
           <w:bCs/>
+          <w:noProof/>
           <w:kern w:val="0"/>
           <w:lang w:eastAsia="en-IN"/>
           <w14:ligatures w14:val="none"/>
@@ -4263,7 +4811,7 @@
                     <pic:cNvPicPr/>
                   </pic:nvPicPr>
                   <pic:blipFill>
-                    <a:blip r:embed="rId9">
+                    <a:blip r:embed="rId8">
                       <a:extLst>
                         <a:ext uri="{28A0092B-C50C-407E-A947-70E740481C1C}">
                           <a14:useLocalDpi xmlns:a14="http://schemas.microsoft.com/office/drawing/2010/main" val="0"/>
@@ -4844,6 +5392,7 @@
       <w:r>
         <w:rPr>
           <w:rFonts w:ascii="Aptos" w:eastAsia="Times New Roman" w:hAnsi="Aptos" w:cs="Times New Roman"/>
+          <w:noProof/>
           <w:kern w:val="0"/>
           <w:lang w:eastAsia="en-IN"/>
           <w14:ligatures w14:val="none"/>
@@ -4864,7 +5413,7 @@
                     <pic:cNvPicPr/>
                   </pic:nvPicPr>
                   <pic:blipFill>
-                    <a:blip r:embed="rId10"/>
+                    <a:blip r:embed="rId9"/>
                     <a:stretch>
                       <a:fillRect/>
                     </a:stretch>
@@ -5203,7 +5752,19 @@
           <w:lang w:eastAsia="en-IN"/>
           <w14:ligatures w14:val="none"/>
         </w:rPr>
-        <w:t>"].</w:t>
+        <w:t>"</w:t>
+      </w:r>
+      <w:proofErr w:type="gramStart"/>
+      <w:r>
+        <w:rPr>
+          <w:rFonts w:ascii="Aptos" w:eastAsia="Times New Roman" w:hAnsi="Aptos" w:cs="Times New Roman"/>
+          <w:b/>
+          <w:bCs/>
+          <w:kern w:val="0"/>
+          <w:lang w:eastAsia="en-IN"/>
+          <w14:ligatures w14:val="none"/>
+        </w:rPr>
+        <w:t>].</w:t>
       </w:r>
       <w:proofErr w:type="spellStart"/>
       <w:r>
@@ -5218,6 +5779,7 @@
         <w:t>fillna</w:t>
       </w:r>
       <w:proofErr w:type="spellEnd"/>
+      <w:proofErr w:type="gramEnd"/>
       <w:r>
         <w:rPr>
           <w:rFonts w:ascii="Aptos" w:eastAsia="Times New Roman" w:hAnsi="Aptos" w:cs="Times New Roman"/>
@@ -5337,7 +5899,19 @@
           <w:lang w:eastAsia="en-IN"/>
           <w14:ligatures w14:val="none"/>
         </w:rPr>
-        <w:t>"].</w:t>
+        <w:t>"</w:t>
+      </w:r>
+      <w:proofErr w:type="gramStart"/>
+      <w:r>
+        <w:rPr>
+          <w:rFonts w:ascii="Aptos" w:eastAsia="Times New Roman" w:hAnsi="Aptos" w:cs="Times New Roman"/>
+          <w:b/>
+          <w:bCs/>
+          <w:kern w:val="0"/>
+          <w:lang w:eastAsia="en-IN"/>
+          <w14:ligatures w14:val="none"/>
+        </w:rPr>
+        <w:t>].</w:t>
       </w:r>
       <w:proofErr w:type="spellStart"/>
       <w:r>
@@ -5352,6 +5926,7 @@
         <w:t>fillna</w:t>
       </w:r>
       <w:proofErr w:type="spellEnd"/>
+      <w:proofErr w:type="gramEnd"/>
       <w:r>
         <w:rPr>
           <w:rFonts w:ascii="Aptos" w:eastAsia="Times New Roman" w:hAnsi="Aptos" w:cs="Times New Roman"/>
@@ -5469,7 +6044,19 @@
           <w:lang w:eastAsia="en-IN"/>
           <w14:ligatures w14:val="none"/>
         </w:rPr>
-        <w:t>"].</w:t>
+        <w:t>"</w:t>
+      </w:r>
+      <w:proofErr w:type="gramStart"/>
+      <w:r>
+        <w:rPr>
+          <w:rFonts w:ascii="Aptos" w:eastAsia="Times New Roman" w:hAnsi="Aptos" w:cs="Times New Roman"/>
+          <w:b/>
+          <w:bCs/>
+          <w:kern w:val="0"/>
+          <w:lang w:eastAsia="en-IN"/>
+          <w14:ligatures w14:val="none"/>
+        </w:rPr>
+        <w:t>].</w:t>
       </w:r>
       <w:proofErr w:type="spellStart"/>
       <w:r>
@@ -5484,6 +6071,7 @@
         <w:t>fillna</w:t>
       </w:r>
       <w:proofErr w:type="spellEnd"/>
+      <w:proofErr w:type="gramEnd"/>
       <w:r>
         <w:rPr>
           <w:rFonts w:ascii="Aptos" w:eastAsia="Times New Roman" w:hAnsi="Aptos" w:cs="Times New Roman"/>
@@ -5667,19 +6255,43 @@
           <w:lang w:eastAsia="en-IN"/>
           <w14:ligatures w14:val="none"/>
         </w:rPr>
-        <w:t>value_counts</w:t>
-      </w:r>
-      <w:proofErr w:type="spellEnd"/>
-      <w:r>
-        <w:rPr>
-          <w:rFonts w:ascii="Aptos" w:eastAsia="Times New Roman" w:hAnsi="Aptos" w:cs="Times New Roman"/>
-          <w:b/>
-          <w:bCs/>
-          <w:kern w:val="0"/>
-          <w:lang w:eastAsia="en-IN"/>
-          <w14:ligatures w14:val="none"/>
-        </w:rPr>
-        <w:t>()</w:t>
+        <w:t>value_</w:t>
+      </w:r>
+      <w:proofErr w:type="gramStart"/>
+      <w:r>
+        <w:rPr>
+          <w:rFonts w:ascii="Aptos" w:eastAsia="Times New Roman" w:hAnsi="Aptos" w:cs="Times New Roman"/>
+          <w:b/>
+          <w:bCs/>
+          <w:kern w:val="0"/>
+          <w:lang w:eastAsia="en-IN"/>
+          <w14:ligatures w14:val="none"/>
+        </w:rPr>
+        <w:t>counts</w:t>
+      </w:r>
+      <w:proofErr w:type="spellEnd"/>
+      <w:r>
+        <w:rPr>
+          <w:rFonts w:ascii="Aptos" w:eastAsia="Times New Roman" w:hAnsi="Aptos" w:cs="Times New Roman"/>
+          <w:b/>
+          <w:bCs/>
+          <w:kern w:val="0"/>
+          <w:lang w:eastAsia="en-IN"/>
+          <w14:ligatures w14:val="none"/>
+        </w:rPr>
+        <w:t>(</w:t>
+      </w:r>
+      <w:proofErr w:type="gramEnd"/>
+      <w:r>
+        <w:rPr>
+          <w:rFonts w:ascii="Aptos" w:eastAsia="Times New Roman" w:hAnsi="Aptos" w:cs="Times New Roman"/>
+          <w:b/>
+          <w:bCs/>
+          <w:kern w:val="0"/>
+          <w:lang w:eastAsia="en-IN"/>
+          <w14:ligatures w14:val="none"/>
+        </w:rPr>
+        <w:t>)</w:t>
       </w:r>
       <w:r>
         <w:rPr>
@@ -5816,6 +6428,7 @@
         </w:rPr>
       </w:pPr>
       <w:proofErr w:type="spellStart"/>
+      <w:proofErr w:type="gramStart"/>
       <w:r>
         <w:rPr>
           <w:rFonts w:ascii="Aptos" w:eastAsia="Times New Roman" w:hAnsi="Aptos" w:cs="Times New Roman"/>
@@ -5828,6 +6441,7 @@
         <w:t>plt.figure</w:t>
       </w:r>
       <w:proofErr w:type="spellEnd"/>
+      <w:proofErr w:type="gramEnd"/>
       <w:r>
         <w:rPr>
           <w:rFonts w:ascii="Aptos" w:eastAsia="Times New Roman" w:hAnsi="Aptos" w:cs="Times New Roman"/>
@@ -5852,16 +6466,29 @@
         <w:t>figsize</w:t>
       </w:r>
       <w:proofErr w:type="spellEnd"/>
-      <w:r>
-        <w:rPr>
-          <w:rFonts w:ascii="Aptos" w:eastAsia="Times New Roman" w:hAnsi="Aptos" w:cs="Times New Roman"/>
-          <w:b/>
-          <w:bCs/>
-          <w:kern w:val="0"/>
-          <w:lang w:eastAsia="en-IN"/>
-          <w14:ligatures w14:val="none"/>
-        </w:rPr>
-        <w:t>=(8, 5))</w:t>
+      <w:proofErr w:type="gramStart"/>
+      <w:r>
+        <w:rPr>
+          <w:rFonts w:ascii="Aptos" w:eastAsia="Times New Roman" w:hAnsi="Aptos" w:cs="Times New Roman"/>
+          <w:b/>
+          <w:bCs/>
+          <w:kern w:val="0"/>
+          <w:lang w:eastAsia="en-IN"/>
+          <w14:ligatures w14:val="none"/>
+        </w:rPr>
+        <w:t>=(</w:t>
+      </w:r>
+      <w:proofErr w:type="gramEnd"/>
+      <w:r>
+        <w:rPr>
+          <w:rFonts w:ascii="Aptos" w:eastAsia="Times New Roman" w:hAnsi="Aptos" w:cs="Times New Roman"/>
+          <w:b/>
+          <w:bCs/>
+          <w:kern w:val="0"/>
+          <w:lang w:eastAsia="en-IN"/>
+          <w14:ligatures w14:val="none"/>
+        </w:rPr>
+        <w:t>8, 5))</w:t>
       </w:r>
     </w:p>
     <w:p>
@@ -5878,6 +6505,7 @@
         </w:rPr>
       </w:pPr>
       <w:proofErr w:type="spellStart"/>
+      <w:proofErr w:type="gramStart"/>
       <w:r>
         <w:rPr>
           <w:rFonts w:ascii="Aptos" w:eastAsia="Times New Roman" w:hAnsi="Aptos" w:cs="Times New Roman"/>
@@ -5890,6 +6518,7 @@
         <w:t>sns.boxplot</w:t>
       </w:r>
       <w:proofErr w:type="spellEnd"/>
+      <w:proofErr w:type="gramEnd"/>
       <w:r>
         <w:rPr>
           <w:rFonts w:ascii="Aptos" w:eastAsia="Times New Roman" w:hAnsi="Aptos" w:cs="Times New Roman"/>
@@ -5964,6 +6593,7 @@
         </w:rPr>
       </w:pPr>
       <w:proofErr w:type="spellStart"/>
+      <w:proofErr w:type="gramStart"/>
       <w:r>
         <w:rPr>
           <w:rFonts w:ascii="Aptos" w:eastAsia="Times New Roman" w:hAnsi="Aptos" w:cs="Times New Roman"/>
@@ -5976,6 +6606,7 @@
         <w:t>plt.title</w:t>
       </w:r>
       <w:proofErr w:type="spellEnd"/>
+      <w:proofErr w:type="gramEnd"/>
       <w:r>
         <w:rPr>
           <w:rFonts w:ascii="Aptos" w:eastAsia="Times New Roman" w:hAnsi="Aptos" w:cs="Times New Roman"/>
@@ -6002,6 +6633,7 @@
         </w:rPr>
       </w:pPr>
       <w:proofErr w:type="spellStart"/>
+      <w:proofErr w:type="gramStart"/>
       <w:r>
         <w:rPr>
           <w:rFonts w:ascii="Aptos" w:eastAsia="Times New Roman" w:hAnsi="Aptos" w:cs="Times New Roman"/>
@@ -6014,6 +6646,7 @@
         <w:t>plt.xlabel</w:t>
       </w:r>
       <w:proofErr w:type="spellEnd"/>
+      <w:proofErr w:type="gramEnd"/>
       <w:r>
         <w:rPr>
           <w:rFonts w:ascii="Aptos" w:eastAsia="Times New Roman" w:hAnsi="Aptos" w:cs="Times New Roman"/>
@@ -6040,6 +6673,7 @@
         </w:rPr>
       </w:pPr>
       <w:proofErr w:type="spellStart"/>
+      <w:proofErr w:type="gramStart"/>
       <w:r>
         <w:rPr>
           <w:rFonts w:ascii="Aptos" w:eastAsia="Times New Roman" w:hAnsi="Aptos" w:cs="Times New Roman"/>
@@ -6052,6 +6686,7 @@
         <w:t>plt.show</w:t>
       </w:r>
       <w:proofErr w:type="spellEnd"/>
+      <w:proofErr w:type="gramEnd"/>
       <w:r>
         <w:rPr>
           <w:rFonts w:ascii="Aptos" w:eastAsia="Times New Roman" w:hAnsi="Aptos" w:cs="Times New Roman"/>
@@ -6089,6 +6724,7 @@
       <w:r>
         <w:rPr>
           <w:rFonts w:ascii="Aptos" w:eastAsia="Times New Roman" w:hAnsi="Aptos" w:cs="Times New Roman"/>
+          <w:noProof/>
           <w:kern w:val="0"/>
           <w:lang w:eastAsia="en-IN"/>
           <w14:ligatures w14:val="none"/>
@@ -6118,7 +6754,7 @@
                     <pic:cNvPicPr/>
                   </pic:nvPicPr>
                   <pic:blipFill>
-                    <a:blip r:embed="rId11">
+                    <a:blip r:embed="rId10">
                       <a:extLst>
                         <a:ext uri="{28A0092B-C50C-407E-A947-70E740481C1C}">
                           <a14:useLocalDpi xmlns:a14="http://schemas.microsoft.com/office/drawing/2010/main" val="0"/>
@@ -6179,6 +6815,7 @@
         </w:rPr>
       </w:pPr>
       <w:proofErr w:type="spellStart"/>
+      <w:proofErr w:type="gramStart"/>
       <w:r>
         <w:rPr>
           <w:rFonts w:ascii="Aptos" w:eastAsia="Times New Roman" w:hAnsi="Aptos" w:cs="Times New Roman"/>
@@ -6191,6 +6828,7 @@
         <w:t>plt.figure</w:t>
       </w:r>
       <w:proofErr w:type="spellEnd"/>
+      <w:proofErr w:type="gramEnd"/>
       <w:r>
         <w:rPr>
           <w:rFonts w:ascii="Aptos" w:eastAsia="Times New Roman" w:hAnsi="Aptos" w:cs="Times New Roman"/>
@@ -6215,16 +6853,29 @@
         <w:t>figsize</w:t>
       </w:r>
       <w:proofErr w:type="spellEnd"/>
-      <w:r>
-        <w:rPr>
-          <w:rFonts w:ascii="Aptos" w:eastAsia="Times New Roman" w:hAnsi="Aptos" w:cs="Times New Roman"/>
-          <w:b/>
-          <w:bCs/>
-          <w:kern w:val="0"/>
-          <w:lang w:eastAsia="en-IN"/>
-          <w14:ligatures w14:val="none"/>
-        </w:rPr>
-        <w:t>=(8, 5))</w:t>
+      <w:proofErr w:type="gramStart"/>
+      <w:r>
+        <w:rPr>
+          <w:rFonts w:ascii="Aptos" w:eastAsia="Times New Roman" w:hAnsi="Aptos" w:cs="Times New Roman"/>
+          <w:b/>
+          <w:bCs/>
+          <w:kern w:val="0"/>
+          <w:lang w:eastAsia="en-IN"/>
+          <w14:ligatures w14:val="none"/>
+        </w:rPr>
+        <w:t>=(</w:t>
+      </w:r>
+      <w:proofErr w:type="gramEnd"/>
+      <w:r>
+        <w:rPr>
+          <w:rFonts w:ascii="Aptos" w:eastAsia="Times New Roman" w:hAnsi="Aptos" w:cs="Times New Roman"/>
+          <w:b/>
+          <w:bCs/>
+          <w:kern w:val="0"/>
+          <w:lang w:eastAsia="en-IN"/>
+          <w14:ligatures w14:val="none"/>
+        </w:rPr>
+        <w:t>8, 5))</w:t>
       </w:r>
     </w:p>
     <w:p>
@@ -6241,6 +6892,7 @@
         </w:rPr>
       </w:pPr>
       <w:proofErr w:type="spellStart"/>
+      <w:proofErr w:type="gramStart"/>
       <w:r>
         <w:rPr>
           <w:rFonts w:ascii="Aptos" w:eastAsia="Times New Roman" w:hAnsi="Aptos" w:cs="Times New Roman"/>
@@ -6253,6 +6905,7 @@
         <w:t>sns.boxplot</w:t>
       </w:r>
       <w:proofErr w:type="spellEnd"/>
+      <w:proofErr w:type="gramEnd"/>
       <w:r>
         <w:rPr>
           <w:rFonts w:ascii="Aptos" w:eastAsia="Times New Roman" w:hAnsi="Aptos" w:cs="Times New Roman"/>
@@ -6327,6 +6980,7 @@
         </w:rPr>
       </w:pPr>
       <w:proofErr w:type="spellStart"/>
+      <w:proofErr w:type="gramStart"/>
       <w:r>
         <w:rPr>
           <w:rFonts w:ascii="Aptos" w:eastAsia="Times New Roman" w:hAnsi="Aptos" w:cs="Times New Roman"/>
@@ -6339,6 +6993,7 @@
         <w:t>plt.title</w:t>
       </w:r>
       <w:proofErr w:type="spellEnd"/>
+      <w:proofErr w:type="gramEnd"/>
       <w:r>
         <w:rPr>
           <w:rFonts w:ascii="Aptos" w:eastAsia="Times New Roman" w:hAnsi="Aptos" w:cs="Times New Roman"/>
@@ -6365,6 +7020,7 @@
         </w:rPr>
       </w:pPr>
       <w:proofErr w:type="spellStart"/>
+      <w:proofErr w:type="gramStart"/>
       <w:r>
         <w:rPr>
           <w:rFonts w:ascii="Aptos" w:eastAsia="Times New Roman" w:hAnsi="Aptos" w:cs="Times New Roman"/>
@@ -6377,6 +7033,7 @@
         <w:t>plt.xlabel</w:t>
       </w:r>
       <w:proofErr w:type="spellEnd"/>
+      <w:proofErr w:type="gramEnd"/>
       <w:r>
         <w:rPr>
           <w:rFonts w:ascii="Aptos" w:eastAsia="Times New Roman" w:hAnsi="Aptos" w:cs="Times New Roman"/>
@@ -6403,6 +7060,7 @@
         </w:rPr>
       </w:pPr>
       <w:proofErr w:type="spellStart"/>
+      <w:proofErr w:type="gramStart"/>
       <w:r>
         <w:rPr>
           <w:rFonts w:ascii="Aptos" w:eastAsia="Times New Roman" w:hAnsi="Aptos" w:cs="Times New Roman"/>
@@ -6415,6 +7073,7 @@
         <w:t>plt.show</w:t>
       </w:r>
       <w:proofErr w:type="spellEnd"/>
+      <w:proofErr w:type="gramEnd"/>
       <w:r>
         <w:rPr>
           <w:rFonts w:ascii="Aptos" w:eastAsia="Times New Roman" w:hAnsi="Aptos" w:cs="Times New Roman"/>
@@ -6455,6 +7114,7 @@
           <w:rFonts w:ascii="Aptos" w:eastAsia="Times New Roman" w:hAnsi="Aptos" w:cs="Times New Roman"/>
           <w:b/>
           <w:bCs/>
+          <w:noProof/>
           <w:kern w:val="0"/>
           <w:lang w:eastAsia="en-IN"/>
           <w14:ligatures w14:val="none"/>
@@ -6476,7 +7136,7 @@
                     <pic:cNvPicPr/>
                   </pic:nvPicPr>
                   <pic:blipFill>
-                    <a:blip r:embed="rId12"/>
+                    <a:blip r:embed="rId11"/>
                     <a:stretch>
                       <a:fillRect/>
                     </a:stretch>
@@ -6637,6 +7297,7 @@
         <w:t xml:space="preserve"> = </w:t>
       </w:r>
       <w:proofErr w:type="spellStart"/>
+      <w:proofErr w:type="gramStart"/>
       <w:r>
         <w:rPr>
           <w:rFonts w:ascii="Aptos" w:eastAsia="Times New Roman" w:hAnsi="Aptos" w:cs="Times New Roman"/>
@@ -6649,6 +7310,7 @@
         <w:t>df.copy</w:t>
       </w:r>
       <w:proofErr w:type="spellEnd"/>
+      <w:proofErr w:type="gramEnd"/>
       <w:r>
         <w:rPr>
           <w:rFonts w:ascii="Aptos" w:eastAsia="Times New Roman" w:hAnsi="Aptos" w:cs="Times New Roman"/>
@@ -6788,7 +7450,19 @@
           <w:lang w:eastAsia="en-IN"/>
           <w14:ligatures w14:val="none"/>
         </w:rPr>
-        <w:t>"].</w:t>
+        <w:t>"</w:t>
+      </w:r>
+      <w:proofErr w:type="gramStart"/>
+      <w:r>
+        <w:rPr>
+          <w:rFonts w:ascii="Aptos" w:eastAsia="Times New Roman" w:hAnsi="Aptos" w:cs="Times New Roman"/>
+          <w:b/>
+          <w:bCs/>
+          <w:kern w:val="0"/>
+          <w:lang w:eastAsia="en-IN"/>
+          <w14:ligatures w14:val="none"/>
+        </w:rPr>
+        <w:t>].</w:t>
       </w:r>
       <w:proofErr w:type="spellStart"/>
       <w:r>
@@ -6803,6 +7477,7 @@
         <w:t>fillna</w:t>
       </w:r>
       <w:proofErr w:type="spellEnd"/>
+      <w:proofErr w:type="gramEnd"/>
       <w:r>
         <w:rPr>
           <w:rFonts w:ascii="Aptos" w:eastAsia="Times New Roman" w:hAnsi="Aptos" w:cs="Times New Roman"/>
@@ -6922,7 +7597,19 @@
           <w:lang w:eastAsia="en-IN"/>
           <w14:ligatures w14:val="none"/>
         </w:rPr>
-        <w:t>"].</w:t>
+        <w:t>"</w:t>
+      </w:r>
+      <w:proofErr w:type="gramStart"/>
+      <w:r>
+        <w:rPr>
+          <w:rFonts w:ascii="Aptos" w:eastAsia="Times New Roman" w:hAnsi="Aptos" w:cs="Times New Roman"/>
+          <w:b/>
+          <w:bCs/>
+          <w:kern w:val="0"/>
+          <w:lang w:eastAsia="en-IN"/>
+          <w14:ligatures w14:val="none"/>
+        </w:rPr>
+        <w:t>].</w:t>
       </w:r>
       <w:proofErr w:type="spellStart"/>
       <w:r>
@@ -6937,6 +7624,7 @@
         <w:t>fillna</w:t>
       </w:r>
       <w:proofErr w:type="spellEnd"/>
+      <w:proofErr w:type="gramEnd"/>
       <w:r>
         <w:rPr>
           <w:rFonts w:ascii="Aptos" w:eastAsia="Times New Roman" w:hAnsi="Aptos" w:cs="Times New Roman"/>
@@ -7056,7 +7744,19 @@
           <w:lang w:eastAsia="en-IN"/>
           <w14:ligatures w14:val="none"/>
         </w:rPr>
-        <w:t>"].</w:t>
+        <w:t>"</w:t>
+      </w:r>
+      <w:proofErr w:type="gramStart"/>
+      <w:r>
+        <w:rPr>
+          <w:rFonts w:ascii="Aptos" w:eastAsia="Times New Roman" w:hAnsi="Aptos" w:cs="Times New Roman"/>
+          <w:b/>
+          <w:bCs/>
+          <w:kern w:val="0"/>
+          <w:lang w:eastAsia="en-IN"/>
+          <w14:ligatures w14:val="none"/>
+        </w:rPr>
+        <w:t>].</w:t>
       </w:r>
       <w:proofErr w:type="spellStart"/>
       <w:r>
@@ -7071,6 +7771,7 @@
         <w:t>fillna</w:t>
       </w:r>
       <w:proofErr w:type="spellEnd"/>
+      <w:proofErr w:type="gramEnd"/>
       <w:r>
         <w:rPr>
           <w:rFonts w:ascii="Aptos" w:eastAsia="Times New Roman" w:hAnsi="Aptos" w:cs="Times New Roman"/>
@@ -7127,19 +7828,56 @@
           <w:lang w:eastAsia="en-IN"/>
           <w14:ligatures w14:val="none"/>
         </w:rPr>
-        <w:t>cleaned_df.isnull</w:t>
-      </w:r>
-      <w:proofErr w:type="spellEnd"/>
-      <w:r>
-        <w:rPr>
-          <w:rFonts w:ascii="Aptos" w:eastAsia="Times New Roman" w:hAnsi="Aptos" w:cs="Times New Roman"/>
-          <w:b/>
-          <w:bCs/>
-          <w:kern w:val="0"/>
-          <w:lang w:eastAsia="en-IN"/>
-          <w14:ligatures w14:val="none"/>
-        </w:rPr>
-        <w:t>().sum()</w:t>
+        <w:t>cleaned_</w:t>
+      </w:r>
+      <w:proofErr w:type="gramStart"/>
+      <w:r>
+        <w:rPr>
+          <w:rFonts w:ascii="Aptos" w:eastAsia="Times New Roman" w:hAnsi="Aptos" w:cs="Times New Roman"/>
+          <w:b/>
+          <w:bCs/>
+          <w:kern w:val="0"/>
+          <w:lang w:eastAsia="en-IN"/>
+          <w14:ligatures w14:val="none"/>
+        </w:rPr>
+        <w:t>df.isnull</w:t>
+      </w:r>
+      <w:proofErr w:type="spellEnd"/>
+      <w:proofErr w:type="gramEnd"/>
+      <w:r>
+        <w:rPr>
+          <w:rFonts w:ascii="Aptos" w:eastAsia="Times New Roman" w:hAnsi="Aptos" w:cs="Times New Roman"/>
+          <w:b/>
+          <w:bCs/>
+          <w:kern w:val="0"/>
+          <w:lang w:eastAsia="en-IN"/>
+          <w14:ligatures w14:val="none"/>
+        </w:rPr>
+        <w:t>(</w:t>
+      </w:r>
+      <w:proofErr w:type="gramStart"/>
+      <w:r>
+        <w:rPr>
+          <w:rFonts w:ascii="Aptos" w:eastAsia="Times New Roman" w:hAnsi="Aptos" w:cs="Times New Roman"/>
+          <w:b/>
+          <w:bCs/>
+          <w:kern w:val="0"/>
+          <w:lang w:eastAsia="en-IN"/>
+          <w14:ligatures w14:val="none"/>
+        </w:rPr>
+        <w:t>).sum</w:t>
+      </w:r>
+      <w:proofErr w:type="gramEnd"/>
+      <w:r>
+        <w:rPr>
+          <w:rFonts w:ascii="Aptos" w:eastAsia="Times New Roman" w:hAnsi="Aptos" w:cs="Times New Roman"/>
+          <w:b/>
+          <w:bCs/>
+          <w:kern w:val="0"/>
+          <w:lang w:eastAsia="en-IN"/>
+          <w14:ligatures w14:val="none"/>
+        </w:rPr>
+        <w:t>()</w:t>
       </w:r>
     </w:p>
     <w:p>
@@ -7235,30 +7973,56 @@
           <w14:ligatures w14:val="none"/>
         </w:rPr>
       </w:pPr>
-      <w:r>
-        <w:rPr>
-          <w:rFonts w:ascii="Aptos" w:eastAsia="Times New Roman" w:hAnsi="Aptos" w:cs="Times New Roman"/>
-          <w:b/>
-          <w:bCs/>
-          <w:kern w:val="0"/>
-          <w:lang w:eastAsia="en-IN"/>
-          <w14:ligatures w14:val="none"/>
-        </w:rPr>
-        <w:t xml:space="preserve">print("Shape:", </w:t>
-      </w:r>
-      <w:proofErr w:type="spellStart"/>
-      <w:r>
-        <w:rPr>
-          <w:rFonts w:ascii="Aptos" w:eastAsia="Times New Roman" w:hAnsi="Aptos" w:cs="Times New Roman"/>
-          <w:b/>
-          <w:bCs/>
-          <w:kern w:val="0"/>
-          <w:lang w:eastAsia="en-IN"/>
-          <w14:ligatures w14:val="none"/>
-        </w:rPr>
-        <w:t>cleaned_df.shape</w:t>
-      </w:r>
-      <w:proofErr w:type="spellEnd"/>
+      <w:proofErr w:type="gramStart"/>
+      <w:r>
+        <w:rPr>
+          <w:rFonts w:ascii="Aptos" w:eastAsia="Times New Roman" w:hAnsi="Aptos" w:cs="Times New Roman"/>
+          <w:b/>
+          <w:bCs/>
+          <w:kern w:val="0"/>
+          <w:lang w:eastAsia="en-IN"/>
+          <w14:ligatures w14:val="none"/>
+        </w:rPr>
+        <w:t>print(</w:t>
+      </w:r>
+      <w:proofErr w:type="gramEnd"/>
+      <w:r>
+        <w:rPr>
+          <w:rFonts w:ascii="Aptos" w:eastAsia="Times New Roman" w:hAnsi="Aptos" w:cs="Times New Roman"/>
+          <w:b/>
+          <w:bCs/>
+          <w:kern w:val="0"/>
+          <w:lang w:eastAsia="en-IN"/>
+          <w14:ligatures w14:val="none"/>
+        </w:rPr>
+        <w:t xml:space="preserve">"Shape:", </w:t>
+      </w:r>
+      <w:proofErr w:type="spellStart"/>
+      <w:r>
+        <w:rPr>
+          <w:rFonts w:ascii="Aptos" w:eastAsia="Times New Roman" w:hAnsi="Aptos" w:cs="Times New Roman"/>
+          <w:b/>
+          <w:bCs/>
+          <w:kern w:val="0"/>
+          <w:lang w:eastAsia="en-IN"/>
+          <w14:ligatures w14:val="none"/>
+        </w:rPr>
+        <w:t>cleaned_</w:t>
+      </w:r>
+      <w:proofErr w:type="gramStart"/>
+      <w:r>
+        <w:rPr>
+          <w:rFonts w:ascii="Aptos" w:eastAsia="Times New Roman" w:hAnsi="Aptos" w:cs="Times New Roman"/>
+          <w:b/>
+          <w:bCs/>
+          <w:kern w:val="0"/>
+          <w:lang w:eastAsia="en-IN"/>
+          <w14:ligatures w14:val="none"/>
+        </w:rPr>
+        <w:t>df.shape</w:t>
+      </w:r>
+      <w:proofErr w:type="spellEnd"/>
+      <w:proofErr w:type="gramEnd"/>
       <w:r>
         <w:rPr>
           <w:rFonts w:ascii="Aptos" w:eastAsia="Times New Roman" w:hAnsi="Aptos" w:cs="Times New Roman"/>
@@ -7284,16 +8048,29 @@
           <w14:ligatures w14:val="none"/>
         </w:rPr>
       </w:pPr>
-      <w:r>
-        <w:rPr>
-          <w:rFonts w:ascii="Aptos" w:eastAsia="Times New Roman" w:hAnsi="Aptos" w:cs="Times New Roman"/>
-          <w:b/>
-          <w:bCs/>
-          <w:kern w:val="0"/>
-          <w:lang w:eastAsia="en-IN"/>
-          <w14:ligatures w14:val="none"/>
-        </w:rPr>
-        <w:t>print("\</w:t>
+      <w:proofErr w:type="gramStart"/>
+      <w:r>
+        <w:rPr>
+          <w:rFonts w:ascii="Aptos" w:eastAsia="Times New Roman" w:hAnsi="Aptos" w:cs="Times New Roman"/>
+          <w:b/>
+          <w:bCs/>
+          <w:kern w:val="0"/>
+          <w:lang w:eastAsia="en-IN"/>
+          <w14:ligatures w14:val="none"/>
+        </w:rPr>
+        <w:t>print(</w:t>
+      </w:r>
+      <w:proofErr w:type="gramEnd"/>
+      <w:r>
+        <w:rPr>
+          <w:rFonts w:ascii="Aptos" w:eastAsia="Times New Roman" w:hAnsi="Aptos" w:cs="Times New Roman"/>
+          <w:b/>
+          <w:bCs/>
+          <w:kern w:val="0"/>
+          <w:lang w:eastAsia="en-IN"/>
+          <w14:ligatures w14:val="none"/>
+        </w:rPr>
+        <w:t>"\</w:t>
       </w:r>
       <w:proofErr w:type="spellStart"/>
       <w:r>
@@ -7352,19 +8129,56 @@
           <w:lang w:eastAsia="en-IN"/>
           <w14:ligatures w14:val="none"/>
         </w:rPr>
-        <w:t>cleaned_df.isnull</w:t>
-      </w:r>
-      <w:proofErr w:type="spellEnd"/>
-      <w:r>
-        <w:rPr>
-          <w:rFonts w:ascii="Aptos" w:eastAsia="Times New Roman" w:hAnsi="Aptos" w:cs="Times New Roman"/>
-          <w:b/>
-          <w:bCs/>
-          <w:kern w:val="0"/>
-          <w:lang w:eastAsia="en-IN"/>
-          <w14:ligatures w14:val="none"/>
-        </w:rPr>
-        <w:t>().sum())</w:t>
+        <w:t>cleaned_</w:t>
+      </w:r>
+      <w:proofErr w:type="gramStart"/>
+      <w:r>
+        <w:rPr>
+          <w:rFonts w:ascii="Aptos" w:eastAsia="Times New Roman" w:hAnsi="Aptos" w:cs="Times New Roman"/>
+          <w:b/>
+          <w:bCs/>
+          <w:kern w:val="0"/>
+          <w:lang w:eastAsia="en-IN"/>
+          <w14:ligatures w14:val="none"/>
+        </w:rPr>
+        <w:t>df.isnull</w:t>
+      </w:r>
+      <w:proofErr w:type="spellEnd"/>
+      <w:proofErr w:type="gramEnd"/>
+      <w:r>
+        <w:rPr>
+          <w:rFonts w:ascii="Aptos" w:eastAsia="Times New Roman" w:hAnsi="Aptos" w:cs="Times New Roman"/>
+          <w:b/>
+          <w:bCs/>
+          <w:kern w:val="0"/>
+          <w:lang w:eastAsia="en-IN"/>
+          <w14:ligatures w14:val="none"/>
+        </w:rPr>
+        <w:t>(</w:t>
+      </w:r>
+      <w:proofErr w:type="gramStart"/>
+      <w:r>
+        <w:rPr>
+          <w:rFonts w:ascii="Aptos" w:eastAsia="Times New Roman" w:hAnsi="Aptos" w:cs="Times New Roman"/>
+          <w:b/>
+          <w:bCs/>
+          <w:kern w:val="0"/>
+          <w:lang w:eastAsia="en-IN"/>
+          <w14:ligatures w14:val="none"/>
+        </w:rPr>
+        <w:t>).sum</w:t>
+      </w:r>
+      <w:proofErr w:type="gramEnd"/>
+      <w:r>
+        <w:rPr>
+          <w:rFonts w:ascii="Aptos" w:eastAsia="Times New Roman" w:hAnsi="Aptos" w:cs="Times New Roman"/>
+          <w:b/>
+          <w:bCs/>
+          <w:kern w:val="0"/>
+          <w:lang w:eastAsia="en-IN"/>
+          <w14:ligatures w14:val="none"/>
+        </w:rPr>
+        <w:t>())</w:t>
       </w:r>
     </w:p>
     <w:p>
@@ -7380,16 +8194,29 @@
           <w14:ligatures w14:val="none"/>
         </w:rPr>
       </w:pPr>
-      <w:r>
-        <w:rPr>
-          <w:rFonts w:ascii="Aptos" w:eastAsia="Times New Roman" w:hAnsi="Aptos" w:cs="Times New Roman"/>
-          <w:b/>
-          <w:bCs/>
-          <w:kern w:val="0"/>
-          <w:lang w:eastAsia="en-IN"/>
-          <w14:ligatures w14:val="none"/>
-        </w:rPr>
-        <w:t>print("Duplicate Rows:")</w:t>
+      <w:proofErr w:type="gramStart"/>
+      <w:r>
+        <w:rPr>
+          <w:rFonts w:ascii="Aptos" w:eastAsia="Times New Roman" w:hAnsi="Aptos" w:cs="Times New Roman"/>
+          <w:b/>
+          <w:bCs/>
+          <w:kern w:val="0"/>
+          <w:lang w:eastAsia="en-IN"/>
+          <w14:ligatures w14:val="none"/>
+        </w:rPr>
+        <w:t>print(</w:t>
+      </w:r>
+      <w:proofErr w:type="gramEnd"/>
+      <w:r>
+        <w:rPr>
+          <w:rFonts w:ascii="Aptos" w:eastAsia="Times New Roman" w:hAnsi="Aptos" w:cs="Times New Roman"/>
+          <w:b/>
+          <w:bCs/>
+          <w:kern w:val="0"/>
+          <w:lang w:eastAsia="en-IN"/>
+          <w14:ligatures w14:val="none"/>
+        </w:rPr>
+        <w:t>"Duplicate Rows:")</w:t>
       </w:r>
     </w:p>
     <w:p>
@@ -7426,19 +8253,56 @@
           <w:lang w:eastAsia="en-IN"/>
           <w14:ligatures w14:val="none"/>
         </w:rPr>
-        <w:t>cleaned_df.duplicated</w:t>
-      </w:r>
-      <w:proofErr w:type="spellEnd"/>
-      <w:r>
-        <w:rPr>
-          <w:rFonts w:ascii="Aptos" w:eastAsia="Times New Roman" w:hAnsi="Aptos" w:cs="Times New Roman"/>
-          <w:b/>
-          <w:bCs/>
-          <w:kern w:val="0"/>
-          <w:lang w:eastAsia="en-IN"/>
-          <w14:ligatures w14:val="none"/>
-        </w:rPr>
-        <w:t>().sum())</w:t>
+        <w:t>cleaned_</w:t>
+      </w:r>
+      <w:proofErr w:type="gramStart"/>
+      <w:r>
+        <w:rPr>
+          <w:rFonts w:ascii="Aptos" w:eastAsia="Times New Roman" w:hAnsi="Aptos" w:cs="Times New Roman"/>
+          <w:b/>
+          <w:bCs/>
+          <w:kern w:val="0"/>
+          <w:lang w:eastAsia="en-IN"/>
+          <w14:ligatures w14:val="none"/>
+        </w:rPr>
+        <w:t>df.duplicated</w:t>
+      </w:r>
+      <w:proofErr w:type="spellEnd"/>
+      <w:proofErr w:type="gramEnd"/>
+      <w:r>
+        <w:rPr>
+          <w:rFonts w:ascii="Aptos" w:eastAsia="Times New Roman" w:hAnsi="Aptos" w:cs="Times New Roman"/>
+          <w:b/>
+          <w:bCs/>
+          <w:kern w:val="0"/>
+          <w:lang w:eastAsia="en-IN"/>
+          <w14:ligatures w14:val="none"/>
+        </w:rPr>
+        <w:t>(</w:t>
+      </w:r>
+      <w:proofErr w:type="gramStart"/>
+      <w:r>
+        <w:rPr>
+          <w:rFonts w:ascii="Aptos" w:eastAsia="Times New Roman" w:hAnsi="Aptos" w:cs="Times New Roman"/>
+          <w:b/>
+          <w:bCs/>
+          <w:kern w:val="0"/>
+          <w:lang w:eastAsia="en-IN"/>
+          <w14:ligatures w14:val="none"/>
+        </w:rPr>
+        <w:t>).sum</w:t>
+      </w:r>
+      <w:proofErr w:type="gramEnd"/>
+      <w:r>
+        <w:rPr>
+          <w:rFonts w:ascii="Aptos" w:eastAsia="Times New Roman" w:hAnsi="Aptos" w:cs="Times New Roman"/>
+          <w:b/>
+          <w:bCs/>
+          <w:kern w:val="0"/>
+          <w:lang w:eastAsia="en-IN"/>
+          <w14:ligatures w14:val="none"/>
+        </w:rPr>
+        <w:t>())</w:t>
       </w:r>
     </w:p>
     <w:p>
@@ -7454,16 +8318,29 @@
           <w14:ligatures w14:val="none"/>
         </w:rPr>
       </w:pPr>
-      <w:r>
-        <w:rPr>
-          <w:rFonts w:ascii="Aptos" w:eastAsia="Times New Roman" w:hAnsi="Aptos" w:cs="Times New Roman"/>
-          <w:b/>
-          <w:bCs/>
-          <w:kern w:val="0"/>
-          <w:lang w:eastAsia="en-IN"/>
-          <w14:ligatures w14:val="none"/>
-        </w:rPr>
-        <w:t>print("Unique Patient IDs:")</w:t>
+      <w:proofErr w:type="gramStart"/>
+      <w:r>
+        <w:rPr>
+          <w:rFonts w:ascii="Aptos" w:eastAsia="Times New Roman" w:hAnsi="Aptos" w:cs="Times New Roman"/>
+          <w:b/>
+          <w:bCs/>
+          <w:kern w:val="0"/>
+          <w:lang w:eastAsia="en-IN"/>
+          <w14:ligatures w14:val="none"/>
+        </w:rPr>
+        <w:t>print(</w:t>
+      </w:r>
+      <w:proofErr w:type="gramEnd"/>
+      <w:r>
+        <w:rPr>
+          <w:rFonts w:ascii="Aptos" w:eastAsia="Times New Roman" w:hAnsi="Aptos" w:cs="Times New Roman"/>
+          <w:b/>
+          <w:bCs/>
+          <w:kern w:val="0"/>
+          <w:lang w:eastAsia="en-IN"/>
+          <w14:ligatures w14:val="none"/>
+        </w:rPr>
+        <w:t>"Unique Patient IDs:")</w:t>
       </w:r>
     </w:p>
     <w:p>
@@ -7536,7 +8413,19 @@
           <w:lang w:eastAsia="en-IN"/>
           <w14:ligatures w14:val="none"/>
         </w:rPr>
-        <w:t>"].</w:t>
+        <w:t>"</w:t>
+      </w:r>
+      <w:proofErr w:type="gramStart"/>
+      <w:r>
+        <w:rPr>
+          <w:rFonts w:ascii="Aptos" w:eastAsia="Times New Roman" w:hAnsi="Aptos" w:cs="Times New Roman"/>
+          <w:b/>
+          <w:bCs/>
+          <w:kern w:val="0"/>
+          <w:lang w:eastAsia="en-IN"/>
+          <w14:ligatures w14:val="none"/>
+        </w:rPr>
+        <w:t>].</w:t>
       </w:r>
       <w:proofErr w:type="spellStart"/>
       <w:r>
@@ -7551,6 +8440,7 @@
         <w:t>nunique</w:t>
       </w:r>
       <w:proofErr w:type="spellEnd"/>
+      <w:proofErr w:type="gramEnd"/>
       <w:r>
         <w:rPr>
           <w:rFonts w:ascii="Aptos" w:eastAsia="Times New Roman" w:hAnsi="Aptos" w:cs="Times New Roman"/>
@@ -7591,6 +8481,7 @@
       <w:r>
         <w:rPr>
           <w:rFonts w:ascii="Aptos" w:eastAsia="Times New Roman" w:hAnsi="Aptos" w:cs="Times New Roman"/>
+          <w:noProof/>
           <w:kern w:val="0"/>
           <w:lang w:eastAsia="en-IN"/>
           <w14:ligatures w14:val="none"/>
@@ -7611,7 +8502,7 @@
                     <pic:cNvPicPr/>
                   </pic:nvPicPr>
                   <pic:blipFill>
-                    <a:blip r:embed="rId13"/>
+                    <a:blip r:embed="rId12"/>
                     <a:stretch>
                       <a:fillRect/>
                     </a:stretch>
@@ -7792,19 +8683,43 @@
           <w:lang w:eastAsia="en-IN"/>
           <w14:ligatures w14:val="none"/>
         </w:rPr>
-        <w:t>cleaned_df.to_csv</w:t>
-      </w:r>
-      <w:proofErr w:type="spellEnd"/>
-      <w:r>
-        <w:rPr>
-          <w:rFonts w:ascii="Aptos" w:eastAsia="Times New Roman" w:hAnsi="Aptos" w:cs="Times New Roman"/>
-          <w:b/>
-          <w:bCs/>
-          <w:kern w:val="0"/>
-          <w:lang w:eastAsia="en-IN"/>
-          <w14:ligatures w14:val="none"/>
-        </w:rPr>
-        <w:t>("cleaned_diabetes_risk.csv", index=False)</w:t>
+        <w:t>cleaned_df.to_</w:t>
+      </w:r>
+      <w:proofErr w:type="gramStart"/>
+      <w:r>
+        <w:rPr>
+          <w:rFonts w:ascii="Aptos" w:eastAsia="Times New Roman" w:hAnsi="Aptos" w:cs="Times New Roman"/>
+          <w:b/>
+          <w:bCs/>
+          <w:kern w:val="0"/>
+          <w:lang w:eastAsia="en-IN"/>
+          <w14:ligatures w14:val="none"/>
+        </w:rPr>
+        <w:t>csv</w:t>
+      </w:r>
+      <w:proofErr w:type="spellEnd"/>
+      <w:r>
+        <w:rPr>
+          <w:rFonts w:ascii="Aptos" w:eastAsia="Times New Roman" w:hAnsi="Aptos" w:cs="Times New Roman"/>
+          <w:b/>
+          <w:bCs/>
+          <w:kern w:val="0"/>
+          <w:lang w:eastAsia="en-IN"/>
+          <w14:ligatures w14:val="none"/>
+        </w:rPr>
+        <w:t>(</w:t>
+      </w:r>
+      <w:proofErr w:type="gramEnd"/>
+      <w:r>
+        <w:rPr>
+          <w:rFonts w:ascii="Aptos" w:eastAsia="Times New Roman" w:hAnsi="Aptos" w:cs="Times New Roman"/>
+          <w:b/>
+          <w:bCs/>
+          <w:kern w:val="0"/>
+          <w:lang w:eastAsia="en-IN"/>
+          <w14:ligatures w14:val="none"/>
+        </w:rPr>
+        <w:t>"cleaned_diabetes_risk.csv", index=False)</w:t>
       </w:r>
     </w:p>
     <w:p>
@@ -8371,7 +9286,6 @@
     </w:p>
     <w:p>
       <w:pPr>
-        <w:pStyle w:val="Heading2Char"/>
         <w:numPr>
           <w:ilvl w:val="0"/>
           <w:numId w:val="6"/>
@@ -8390,7 +9304,7 @@
         </w:rPr>
         <w:t xml:space="preserve">Dataset source: </w:t>
       </w:r>
-      <w:hyperlink r:id="rId14" w:history="1">
+      <w:hyperlink r:id="rId13" w:history="1">
         <w:r>
           <w:rPr>
             <w:rStyle w:val="Hyperlink"/>
@@ -8402,7 +9316,6 @@
     </w:p>
     <w:p>
       <w:pPr>
-        <w:pStyle w:val="Heading2Char"/>
         <w:numPr>
           <w:ilvl w:val="0"/>
           <w:numId w:val="6"/>
@@ -8418,7 +9331,7 @@
         </w:rPr>
         <w:t xml:space="preserve">Data Cleaning Techniques: </w:t>
       </w:r>
-      <w:hyperlink r:id="rId15" w:history="1">
+      <w:hyperlink r:id="rId14" w:history="1">
         <w:r>
           <w:rPr>
             <w:rStyle w:val="Hyperlink"/>
@@ -9840,6 +10753,7 @@
   <w:style w:type="character" w:default="1" w:styleId="DefaultParagraphFont">
     <w:name w:val="Default Paragraph Font"/>
     <w:uiPriority w:val="1"/>
+    <w:semiHidden/>
     <w:unhideWhenUsed/>
   </w:style>
   <w:style w:type="table" w:default="1" w:styleId="TableNormal">

</xml_diff>